<commit_message>
Refresh presentation and bilingual script for the final game build
</commit_message>
<xml_diff>
--- a/presentation/Little_Rascal_Speaker_Script_EN_ZH.docx
+++ b/presentation/Little_Rascal_Speaker_Script_EN_ZH.docx
@@ -22,7 +22,7 @@
       <w:r>
         <w:t>English slides + English narration + Chinese rehearsal translation.</w:t>
         <w:br/>
-        <w:t>English narration: approximately 777 words. Plan for 6½–7½ minutes of speech plus a two-minute edited demonstration; rehearse to remain under ten minutes.</w:t>
+        <w:t>English narration: approximately 804 words. Plan for 6½–7½ minutes of speech plus a two-minute edited demonstration; rehearse to remain under ten minutes.</w:t>
       </w:r>
     </w:p>
     <w:p>
@@ -91,13 +91,13 @@
     </w:p>
     <w:p>
       <w:r>
-        <w:t>Full game: https://itsangelia.github.io/little-rascal/?v=b5fe1fc</w:t>
+        <w:t>Full game: https://itsangelia.github.io/little-rascal/?v=ef6daa9</w:t>
         <w:br/>
-        <w:t>Youth preview: https://itsangelia.github.io/little-rascal/previews/youth/?v=b5fe1fc</w:t>
+        <w:t>Youth preview: https://itsangelia.github.io/little-rascal/previews/youth/?v=ef6daa9</w:t>
         <w:br/>
-        <w:t>Senior preview: https://itsangelia.github.io/little-rascal/previews/elder/?v=b5fe1fc</w:t>
+        <w:t>Senior preview: https://itsangelia.github.io/little-rascal/previews/elder/?v=ef6daa9</w:t>
         <w:br/>
-        <w:t>Farewell preview: https://itsangelia.github.io/little-rascal/previews/farewell/?v=b5fe1fc</w:t>
+        <w:t>Farewell preview: https://itsangelia.github.io/little-rascal/previews/farewell/?v=ef6daa9</w:t>
       </w:r>
     </w:p>
     <w:p>
@@ -272,7 +272,7 @@
         <w:pStyle w:val="Subtitle"/>
       </w:pPr>
       <w:r>
-        <w:t>Suggested time / 建议用时: 38 seconds</w:t>
+        <w:t>Suggested time / 建议用时: 44 seconds</w:t>
       </w:r>
     </w:p>
     <w:p>
@@ -285,7 +285,7 @@
     </w:p>
     <w:p>
       <w:r>
-        <w:t>The experience begins with a gently moving egg. Clicking it triggers a shooting-star arrival, followed by a naming screen and a short guide. Naming gives the player a personal entry into the relationship. The main loop then combines care with visible feedback. Growth follows useful interactions and the next sleep and waking, rather than a single upgrade button. The final farewell leads back to an egg, so the life cycle can begin again.</w:t>
+        <w:t>The experience begins with a gently moving egg. Clicking it triggers a shooting-star arrival, followed by naming and a short guide. Naming gives the player a personal entry into the relationship. The main loop combines care with visible feedback. Growth follows useful interactions and the next sleep and waking. An accepted sleep lasts at least three visible seconds after arrival at the nest, making rest easier to notice. The final farewell leads back to an egg, so the life cycle can begin again.</w:t>
       </w:r>
     </w:p>
     <w:p>
@@ -298,7 +298,20 @@
     </w:p>
     <w:p>
       <w:r>
-        <w:t>体验从一颗轻轻晃动的蛋开始。点击后会出现流星出场动画，接着进入起名和简短说明。起名让玩家更个人化地进入这段关系。主体循环把照顾行为和可见反馈连接起来。成长需要有效互动，并在下一次睡醒后发生，而不是点击一次升级按钮。最后的告别会回到一颗新蛋，让生命循环重新开始。</w:t>
+        <w:t>体验从一颗轻轻晃动的蛋开始。点击后会出现流星出场动画，接着进入起名和简短说明。起名让玩家更个人化地进入这段关系。主体循环把照顾行为和可见反馈连接起来。成长需要有效互动，并在下一次睡醒后发生。一次被接受的睡觉操作，在到达巢里后至少会有三秒可见的睡眠，让休息更容易被玩家注意到。最后的告别会回到一颗新蛋，让生命循环重新开始。</w:t>
+      </w:r>
+    </w:p>
+    <w:p>
+      <w:pPr>
+        <w:pStyle w:val="Heading2"/>
+      </w:pPr>
+      <w:r>
+        <w:t>Presentation cue / 操作提示</w:t>
+      </w:r>
+    </w:p>
+    <w:p>
+      <w:r>
+        <w:t>Accepted sleep has a minimum of three visible active seconds after nest arrival and also waits for energy to reach at least 80. This does not change growth qualification: two effective feeds plus two other care actions, then the next waking. Youth can still refuse an unneeded full-energy sleep request.</w:t>
       </w:r>
     </w:p>
     <w:p>
@@ -612,7 +625,7 @@
         <w:pStyle w:val="Subtitle"/>
       </w:pPr>
       <w:r>
-        <w:t>Suggested time / 建议用时: 40 seconds</w:t>
+        <w:t>Suggested time / 建议用时: 43 seconds</w:t>
       </w:r>
     </w:p>
     <w:p>
@@ -625,7 +638,7 @@
     </w:p>
     <w:p>
       <w:r>
-        <w:t>Technically, the game uses two-dimensional programming with pseudo-three-dimensional movement. Ground position and jump height are calculated separately. Depth scaling, object sorting by floor position and an anchored shadow create the impression of space. Supporting scripts handle hatching, naming, stages, the toy, music and the ending, while the main sketch coordinates gameplay. Background music is enabled by default, but the browser may require the player’s first gesture before allowing playback.</w:t>
+        <w:t>The game uses two-dimensional programming with pseudo-three-dimensional movement. Ground position and jump height are separate; depth scaling, Y sorting and shadows create space. Focused scripts handle stages, the toy, music and other systems. Internal game coordinates remain nine hundred by six hundred and forty. CSS fits the display to the window without changing the layout, and a player-clicked button enables fullscreen where supported. The native naming input remains aligned during resizing. Music is enabled by default, but browser policy may require the first player gesture before playback.</w:t>
       </w:r>
     </w:p>
     <w:p>
@@ -638,7 +651,20 @@
     </w:p>
     <w:p>
       <w:r>
-        <w:t>技术上，游戏使用二维编程实现伪三维运动。地面位置和跳跃高度分别计算，再通过远近缩放、按地面位置排序绘制，以及贴地阴影，营造空间感。出场、起名、成长、玩具、音乐和结尾由对应脚本处理，主 sketch 负责协调游戏逻辑。背景音乐默认开启，但浏览器可能需要玩家第一次交互后才允许播放。</w:t>
+        <w:t>游戏使用二维编程实现伪三维运动。地面位置和跳跃高度分别计算，再通过远近缩放、按地面位置排序和阴影营造空间感。成长阶段、玩具、音乐等系统由对应脚本负责。游戏内部坐标始终保持九百乘六百四十。CSS 在不改变布局的情况下让显示大小适应窗口，玩家也可以点击按钮进入浏览器支持的全屏模式。原生起名输入框在窗口变化时仍会保持对齐。音乐默认开启，但受浏览器规则影响，可能需要玩家第一次交互后才允许播放。</w:t>
+      </w:r>
+    </w:p>
+    <w:p>
+      <w:pPr>
+        <w:pStyle w:val="Heading2"/>
+      </w:pPr>
+      <w:r>
+        <w:t>Presentation cue / 操作提示</w:t>
+      </w:r>
+    </w:p>
+    <w:p>
+      <w:r>
+        <w:t>Final release ef6daa9: viewport.js and style.css scale the canvas display only; no resizeCanvas() or internal coordinate/physics changes. Aspect ratio is preserved, so cream margins may remain. Fullscreen is user-triggered on the document root and depends on browser support; this keeps the native naming form visible and aligned. Background audio retains browser-gesture unlocking. Window fit does not establish full mobile/accessibility support.</w:t>
       </w:r>
     </w:p>
     <w:p>
@@ -672,7 +698,7 @@
     </w:p>
     <w:p>
       <w:r>
-        <w:t>Development involved repeated designer-led revisions. Examples include replacing remote-looking toy contact with a contact-timed kick, giving seniors short hops and real rest periods, and simplifying the life cycle to three stages. Browser checks help verify interactions, growth and the ending. They do not establish emotional effectiveness. The next step is to observe actual players and revise from that evidence. Other limitations include fixed canvas dimensions, no saved progress and a need for further accessibility work.</w:t>
+        <w:t>Development involved repeated designer-led revisions: improving contact-timed kicks, giving seniors short hops and rest periods, and simplifying the life cycle to three stages. The final visual pass unifies the watercolor room and interface, with window fitting and fullscreen. Browser checks verify interactions, growth and the ending, but do not establish emotional effectiveness. The next step is to observe actual players. Saved progress is not implemented, and accessibility and longer play-session balancing remain future work.</w:t>
       </w:r>
     </w:p>
     <w:p>
@@ -685,7 +711,20 @@
     </w:p>
     <w:p>
       <w:r>
-        <w:t>开发过程中进行了多次由设计者主导的调整，例如把看起来隔空互动的玩球改成接触后踢球，让老年宠物有短跳和真正的休息，并把生命周期简化成三个阶段。浏览器检查帮助验证互动、成长和结尾流程，但它们不能证明情感效果。下一步应该观察真实玩家，并根据证据修改。另外，目前仍有固定画布、没有保存进度，以及可访问性尚待完善等限制。</w:t>
+        <w:t>开发过程中进行了多次由设计者主导的调整：优化接触后踢球的反馈，让老年宠物有短跳和真正的休息，并把生命周期简化成三个阶段。最后的视觉调整统一了水彩房间和界面，并加入窗口适配与全屏。浏览器检查帮助验证互动、成长和结尾流程，但不能证明情感效果。下一步应该观察真实玩家。目前尚未实现进度保存，可访问性和更长试玩过程中的平衡，也仍需要后续完善。</w:t>
+      </w:r>
+    </w:p>
+    <w:p>
+      <w:pPr>
+        <w:pStyle w:val="Heading2"/>
+      </w:pPr>
+      <w:r>
+        <w:t>Presentation cue / 操作提示</w:t>
+      </w:r>
+    </w:p>
+    <w:p>
+      <w:r>
+        <w:t>Distinguish implemented iteration from future work. The current internal canvas is fixed at 900 × 640 but its CSS display now fits the window; do not call the released game non-responsive solely because coordinates are fixed. No audience study, participant counts or emotional-effectiveness metrics are claimed. Saved progress, further accessibility and longer balancing are proposals, not implemented features.</w:t>
       </w:r>
     </w:p>
     <w:p>
@@ -745,7 +784,7 @@
     </w:p>
     <w:p>
       <w:r>
-        <w:t>Playable game: https://itsangelia.github.io/little-rascal/?v=b5fe1fc</w:t>
+        <w:t>Playable game: https://itsangelia.github.io/little-rascal/?v=ef6daa9</w:t>
       </w:r>
     </w:p>
     <w:p>

</xml_diff>

<commit_message>
Update presentation and bilingual script for current care rules and recorded audio
</commit_message>
<xml_diff>
--- a/presentation/Little_Rascal_Speaker_Script_EN_ZH.docx
+++ b/presentation/Little_Rascal_Speaker_Script_EN_ZH.docx
@@ -22,7 +22,7 @@
       <w:r>
         <w:t>English slides + English narration + Chinese rehearsal translation.</w:t>
         <w:br/>
-        <w:t>English narration: approximately 804 words. Plan for 6½–7½ minutes of speech plus a two-minute edited demonstration; rehearse to remain under ten minutes.</w:t>
+        <w:t>English narration: approximately 808 words. Plan for 6½–7½ minutes of speech plus a two-minute edited demonstration; rehearse to remain under ten minutes.</w:t>
       </w:r>
     </w:p>
     <w:p>
@@ -91,13 +91,13 @@
     </w:p>
     <w:p>
       <w:r>
-        <w:t>Full game: https://itsangelia.github.io/little-rascal/?v=ef6daa9</w:t>
+        <w:t>Full game: https://itsangelia.github.io/little-rascal/?v=d3ab74f</w:t>
         <w:br/>
-        <w:t>Youth preview: https://itsangelia.github.io/little-rascal/previews/youth/?v=ef6daa9</w:t>
+        <w:t>Youth preview: https://itsangelia.github.io/little-rascal/previews/youth/?v=d3ab74f</w:t>
         <w:br/>
-        <w:t>Senior preview: https://itsangelia.github.io/little-rascal/previews/elder/?v=ef6daa9</w:t>
+        <w:t>Senior preview: https://itsangelia.github.io/little-rascal/previews/elder/?v=d3ab74f</w:t>
         <w:br/>
-        <w:t>Farewell preview: https://itsangelia.github.io/little-rascal/previews/farewell/?v=ef6daa9</w:t>
+        <w:t>Farewell preview: https://itsangelia.github.io/little-rascal/previews/farewell/?v=d3ab74f</w:t>
       </w:r>
     </w:p>
     <w:p>
@@ -285,7 +285,7 @@
     </w:p>
     <w:p>
       <w:r>
-        <w:t>The experience begins with a gently moving egg. Clicking it triggers a shooting-star arrival, followed by naming and a short guide. Naming gives the player a personal entry into the relationship. The main loop combines care with visible feedback. Growth follows useful interactions and the next sleep and waking. An accepted sleep lasts at least three visible seconds after arrival at the nest, making rest easier to notice. The final farewell leads back to an egg, so the life cycle can begin again.</w:t>
+        <w:t>The experience begins with a gently moving egg. Clicking it triggers a shooting-star arrival, naming and a short guide. Naming gives the player a personal entry into the relationship. Childhood growth now requires three effective feeds and three petting actions, followed by the next sleep and waking. Below thirty energy, the little one automatically goes to bed. Sleep remains visible for at least three seconds and restores energy before waking. The final farewell leads back to an egg, so the life cycle can begin again.</w:t>
       </w:r>
     </w:p>
     <w:p>
@@ -298,7 +298,7 @@
     </w:p>
     <w:p>
       <w:r>
-        <w:t>体验从一颗轻轻晃动的蛋开始。点击后会出现流星出场动画，接着进入起名和简短说明。起名让玩家更个人化地进入这段关系。主体循环把照顾行为和可见反馈连接起来。成长需要有效互动，并在下一次睡醒后发生。一次被接受的睡觉操作，在到达巢里后至少会有三秒可见的睡眠，让休息更容易被玩家注意到。最后的告别会回到一颗新蛋，让生命循环重新开始。</w:t>
+        <w:t>体验从一颗轻轻晃动的蛋开始。点击后出现流星出场、起名和简短说明。起名让玩家更个人化地进入这段关系。现在，幼儿期需要累计三次有效喂食和三次摸摸，再在下一次睡醒后长大。能量低于三十时，幼儿会自动去睡觉。睡眠至少有三秒可见过程，并恢复能量后醒来。最后的告别会回到新蛋，开始下一轮生命。</w:t>
       </w:r>
     </w:p>
     <w:p>
@@ -311,7 +311,7 @@
     </w:p>
     <w:p>
       <w:r>
-        <w:t>Accepted sleep has a minimum of three visible active seconds after nest arrival and also waits for energy to reach at least 80. This does not change growth qualification: two effective feeds plus two other care actions, then the next waking. Youth can still refuse an unneeded full-energy sleep request.</w:t>
+        <w:t>Child → Youth: 3 effective feeds (hunger ≤95, available for care) +3 accepted PET actions, then next completed sleep. PLAY, toy rewards and CLEAN do not replace childhood PET. Youth → Senior retains2 effective feeds+2 other care actions. Child auto-sleeps strictly below30 energy after current care/play; other stages retain≤8. At least3 visible seconds asleep AND energy≥80 to wake. Never show growth before waking.</w:t>
       </w:r>
     </w:p>
     <w:p>
@@ -345,7 +345,7 @@
     </w:p>
     <w:p>
       <w:r>
-        <w:t>The released game has three stages: Little One, Youth and Senior. The youngest stage introduces the care loop. Youth adds independence through refusal and boredom, making the character less predictable. The senior keeps the same recognizable stars and body language, but moves in small hopping bursts with pauses to rest. It also asks for affection through a thought bubble. Changing behaviour, as well as appearance, is what makes the stages feel different.</w:t>
+        <w:t>The released game has three stages: Little One, Youth and Senior. Childhood is more vocal, with occasional spontaneous humming during eligible idle time. Its feeding, petting and rest introduce responsibility. Youth adds independence through refusal and boredom. The senior keeps the recognizable stars, but moves in small hopping bursts with pauses to rest and asks for affection through a thought bubble. Changing behaviour and sound, as well as appearance, make the stages feel different.</w:t>
       </w:r>
     </w:p>
     <w:p>
@@ -358,7 +358,20 @@
     </w:p>
     <w:p>
       <w:r>
-        <w:t>正式版共有三个阶段：幼年、青年和老年。幼年阶段介绍基础照顾循环。青年阶段通过拒绝和厌烦表现独立性，让角色不那么可预测。老年阶段保留熟悉的星星和身体特征，但改成小幅连续跳动，并停下来休息，还会通过气泡表达想被抚摸的需要。让阶段产生差异的，不只是外形，还有行为。</w:t>
+        <w:t>正式版共有幼年、青年和老年三个阶段。幼儿期会在空闲时偶尔自然哼哼，喂食、摸摸和休息让玩家建立照顾的责任感。青年通过拒绝和厌烦表现独立性。老年保留熟悉的星星外形，但以短跳和停顿表现衰老，并通过气泡请求抚摸。阶段差异来自行为、声音与外形的共同变化。</w:t>
+      </w:r>
+    </w:p>
+    <w:p>
+      <w:pPr>
+        <w:pStyle w:val="Heading2"/>
+      </w:pPr>
+      <w:r>
+        <w:t>Presentation cue / 操作提示</w:t>
+      </w:r>
+    </w:p>
+    <w:p>
+      <w:r>
+        <w:t>Child humL:7–10 eligible idle seconds; Youth/Senior:10–18. Busy actions, distress, sleep, dialogs and hidden tabs pause/suppress humming. Childhood waste:24–36s ordinary scheduling;8–12s after meals. Other stages:18–30s /5–8.5s. Existing illness deadlines remain6s flies,13s fatal.</w:t>
       </w:r>
     </w:p>
     <w:p>
@@ -418,7 +431,7 @@
         <w:pStyle w:val="Heading1"/>
       </w:pPr>
       <w:r>
-        <w:t>07  Bring interaction into the room</w:t>
+        <w:t>07  Let the pet show and voice its needs</w:t>
       </w:r>
     </w:p>
     <w:p>
@@ -439,7 +452,7 @@
     </w:p>
     <w:p>
       <w:r>
-        <w:t>The floor toy makes play a physical action in the room. The player can pick it up and throw it, then watch it bounce and roll. The pet approaches it and kicks only when contact is reached. Other needs also have visible consequences. Low hunger produces a flattened pose, and uncleaned waste develops odor and flies. Together, motion and expression help connect an action, its consequence and the next possible response.</w:t>
+        <w:t>The floor toy makes play physical. The player throws it, and the pet kicks only after contact. A short call follows the kick, making the timing clearer. Other recorded sounds distinguish accepted petting, anger and spontaneous humming. A crying cue plays once when crying begins, without looping. Hunger below thirty also changes the body into a flattened pose. This already visualizes a need beyond a bar. Expression, movement and sound work together to help the player understand the pet.</w:t>
       </w:r>
     </w:p>
     <w:p>
@@ -452,7 +465,20 @@
     </w:p>
     <w:p>
       <w:r>
-        <w:t>地上的玩具把玩耍变成了房间里的实际动作。玩家可以拿起球再扔出去，观察它弹跳和滚动。宠物靠近后，只有真正碰到球才会踢球。其他需求同样有可见后果：饥饿较低时会出现饿扁的姿态，没及时清理的粑粑会发臭并出现苍蝇。动作和表情共同连接玩家行为、产生的后果，以及下一步可以作出的回应。</w:t>
+        <w:t>地上的玩具让玩耍成为实际动作。玩家扔出球，宠物只有碰到球才会踢，踢中时的短叫声让反馈更清楚。其他原声分别用于接受摸摸、生气和自然哼哼。哭声只在开始哭泣时播放一次，不会在持续哭泣时循环。饥饿低于三十还会切换成饿扁形态，这已经是数值条之外的需求可视化。表情、动作与声音共同帮助玩家理解宠物。</w:t>
+      </w:r>
+    </w:p>
+    <w:p>
+      <w:pPr>
+        <w:pStyle w:val="Heading2"/>
+      </w:pPr>
+      <w:r>
+        <w:t>Presentation cue / 操作提示</w:t>
+      </w:r>
+    </w:p>
+    <w:p>
+      <w:r>
+        <w:t>Owner-approved audio: C accepted PET; B anger; A crying onset once per visible episode; D actual friendly toy-contact kick only; L spontaneous humming. Reusable native HTMLAudio playback preserves original pitch/speed. Speaker toggles BGM ONLY; pet effects remain enabled. Calls reduce BGM briefly and restore prior volume. Generic hunger/energy bubbles are not implemented; existing senior affection bubble remains.</w:t>
       </w:r>
     </w:p>
     <w:p>
@@ -512,7 +538,7 @@
     </w:p>
     <w:p>
       <w:r>
-        <w:t>This is a planned 120-second edited gameplay demonstration, not audience-testing evidence. Prepare the actual recording separately. Spoken introduction ≈20 seconds; footage ≈120 seconds. Leave enough screen time to read the envelope/letter; use cuts or clearly marked time compression.</w:t>
+        <w:t>This is a planned 120-second edited gameplay demonstration, not audience-testing evidence. Prepare the actual recording separately. Spoken introduction ≈20 seconds; footage ≈120 seconds. Leave enough screen time to read the envelope/letter; use cuts or clearly marked time compression. Record current audio: C on accepted PET, D at contact, B on Youth anger; include one brief A crying onset and one L idle hum where possible. Show child3feed+3PET readiness and sleep/wake through clearly edited clips. The full life cycle is not claimed to fit uncut into120seconds.</w:t>
       </w:r>
     </w:p>
     <w:p>
@@ -638,7 +664,7 @@
     </w:p>
     <w:p>
       <w:r>
-        <w:t>The game uses two-dimensional programming with pseudo-three-dimensional movement. Ground position and jump height are separate; depth scaling, Y sorting and shadows create space. Focused scripts handle stages, the toy, music and other systems. Internal game coordinates remain nine hundred by six hundred and forty. CSS fits the display to the window without changing the layout, and a player-clicked button enables fullscreen where supported. The native naming input remains aligned during resizing. Music is enabled by default, but browser policy may require the first player gesture before playback.</w:t>
+        <w:t>The game uses two-dimensional programming with pseudo-three-dimensional movement. Ground position and jump height are separate; depth scaling, Y sorting and shadows create space. Internal coordinates remain nine hundred by six hundred and forty, with CSS window fitting and player-triggered fullscreen. Sound uses reusable native audio players, matching the audition page. Recorded clips retain their original pitch and speed. The speaker controls background music only, while pet calls remain audible. Browser gesture handling and playback checks support reliable interaction.</w:t>
       </w:r>
     </w:p>
     <w:p>
@@ -651,7 +677,7 @@
     </w:p>
     <w:p>
       <w:r>
-        <w:t>游戏使用二维编程实现伪三维运动。地面位置和跳跃高度分别计算，再通过远近缩放、按地面位置排序和阴影营造空间感。成长阶段、玩具、音乐等系统由对应脚本负责。游戏内部坐标始终保持九百乘六百四十。CSS 在不改变布局的情况下让显示大小适应窗口，玩家也可以点击按钮进入浏览器支持的全屏模式。原生起名输入框在窗口变化时仍会保持对齐。音乐默认开启，但受浏览器规则影响，可能需要玩家第一次交互后才允许播放。</w:t>
+        <w:t>游戏使用二维编程实现伪三维运动。地面位置与跳跃高度分开计算，再用远近缩放、按地面位置排序和阴影营造空间。内部坐标保持九百乘六百四十，通过 CSS 适配窗口，并由玩家主动点击全屏。声音改用与试听页相同的原生音频播放器，保留原声的音调与速度。扬声器只控制背景音乐，宠物叫声继续保留。手势启动处理与播放检查帮助保障互动反馈。</w:t>
       </w:r>
     </w:p>
     <w:p>
@@ -664,7 +690,7 @@
     </w:p>
     <w:p>
       <w:r>
-        <w:t>Final release ef6daa9: viewport.js and style.css scale the canvas display only; no resizeCanvas() or internal coordinate/physics changes. Aspect ratio is preserved, so cream margins may remain. Fullscreen is user-triggered on the document root and depends on browser support; this keeps the native naming form visible and aligned. Background audio retains browser-gesture unlocking. Window fit does not establish full mobile/accessibility support.</w:t>
+        <w:t>Release d3ab74f. Main scripts: sketch.js care/growth/child sleep; sound-effects.js reusable HTMLAudio, silent gesture warmups, priority and one-shot cues; music.js BGM-only toggle. Native FX volume.9, idle65% relative; BGM briefly ducks to≤.135 then restores without toggling/starting music. p5.sound add-ons are no longer required. Fixed internal coordinates and native input/fullscreen alignment preserved.</w:t>
       </w:r>
     </w:p>
     <w:p>
@@ -698,7 +724,7 @@
     </w:p>
     <w:p>
       <w:r>
-        <w:t>Development involved repeated designer-led revisions: improving contact-timed kicks, giving seniors short hops and rest periods, and simplifying the life cycle to three stages. The final visual pass unifies the watercolor room and interface, with window fitting and fullscreen. Browser checks verify interactions, growth and the ending, but do not establish emotional effectiveness. The next step is to observe actual players. Saved progress is not implemented, and accessibility and longer play-session balancing remain future work.</w:t>
+        <w:t>Designer-led iteration improved contact-timed kicks, senior hops and rest, the watercolor interface, and the three-stage life cycle. Recent changes make childhood growth depend on three feeds and three petting actions, followed by waking, and trigger automatic sleep below thirty energy. Sound was also revised: native playback and mixing checks replaced a fragile audio path. Browser checks verify these behaviours, but do not establish emotional effectiveness. Real audience feedback, saved progress and accessibility remain future work.</w:t>
       </w:r>
     </w:p>
     <w:p>
@@ -711,7 +737,7 @@
     </w:p>
     <w:p>
       <w:r>
-        <w:t>开发过程中进行了多次由设计者主导的调整：优化接触后踢球的反馈，让老年宠物有短跳和真正的休息，并把生命周期简化成三个阶段。最后的视觉调整统一了水彩房间和界面，并加入窗口适配与全屏。浏览器检查帮助验证互动、成长和结尾流程，但不能证明情感效果。下一步应该观察真实玩家。目前尚未实现进度保存，可访问性和更长试玩过程中的平衡，也仍需要后续完善。</w:t>
+        <w:t>设计者主导的迭代改进了接触后踢球、老年的跳动与休息、水彩界面和三阶段生命周期。最近把幼儿成长改为三次有效喂食加三次摸摸后睡醒，并加入能量低于三十的自动睡眠。音频也经过调整：改用原生播放，并检查与背景音乐同时播放时的表现。浏览器检查验证行为，但不能证明情感效果。真实受众反馈、进度保存和可访问性仍是未来方向。</w:t>
       </w:r>
     </w:p>
     <w:p>
@@ -724,7 +750,7 @@
     </w:p>
     <w:p>
       <w:r>
-        <w:t>Distinguish implemented iteration from future work. The current internal canvas is fixed at 900 × 640 but its CSS display now fits the window; do not call the released game non-responsive solely because coordinates are fixed. No audience study, participant counts or emotional-effectiveness metrics are claimed. Saved progress, further accessibility and longer balancing are proposals, not implemented features.</w:t>
+        <w:t>Implemented: childhood3feed+3PET then waking, auto-bed&lt;30, hum7–10eligible seconds, ordinary waste24–36s and meal8–12s; owner-selected C/B/A/D/L audio; native playback checked with BGM active, not only with music muted. No formal audience study or measured emotional-effectiveness claims. Keep prior fixed-canvas/CSS adaptation explanation accurate.</w:t>
       </w:r>
     </w:p>
     <w:p>
@@ -784,7 +810,7 @@
     </w:p>
     <w:p>
       <w:r>
-        <w:t>Playable game: https://itsangelia.github.io/little-rascal/?v=ef6daa9</w:t>
+        <w:t>Playable game: https://itsangelia.github.io/little-rascal/?v=d3ab74f</w:t>
       </w:r>
     </w:p>
     <w:p>
@@ -818,7 +844,7 @@
     </w:p>
     <w:p>
       <w:r>
-        <w:t>This appendix records the design framework, technical library and production references. Before submission, confirm the original source and licence for the background music and add the specific reference-game citation required by your course.</w:t>
+        <w:t>This appendix records the design framework, technical library and production references. Before submission, confirm source and licence credits for the background music and uploaded voice recording, and complete the reference-game citation required by the course.</w:t>
       </w:r>
     </w:p>
     <w:p>
@@ -831,7 +857,7 @@
     </w:p>
     <w:p>
       <w:r>
-        <w:t>附录记录设计框架、技术库和制作参考。提交前，请确认背景音乐原始来源和使用许可，并按课程要求补全参考游戏的具体引用。</w:t>
+        <w:t>附录记录设计框架、技术库和制作参考。提交前请确认背景音乐与上传叫声音频的来源、使用许可，并按课程要求补全参考游戏引用。</w:t>
       </w:r>
     </w:p>
     <w:p>
@@ -844,7 +870,7 @@
     </w:p>
     <w:p>
       <w:r>
-        <w:t>Credits must distinguish uploaded original illustrations from generated design explorations. Do not claim all assets are exclusively hand-drawn by the student. Confirm instructor requirements for AI disclosure. No formal audience study or participant metrics are claimed.</w:t>
+        <w:t>Credits must distinguish uploaded original illustrations from generated design explorations. Do not claim all assets are exclusively hand-drawn by the student. Confirm instructor requirements for AI disclosure. No formal audience study or participant metrics are claimed. Pet calls are edited excerpts from the owner-uploaded 提取的音频.m4a, not generated voices. Do not label them as self-recorded or royalty-free without verification.</w:t>
       </w:r>
     </w:p>
     <w:p>

</xml_diff>

<commit_message>
Rewrite presentation around rubric, iteration evidence and life cycle
</commit_message>
<xml_diff>
--- a/presentation/Little_Rascal_Speaker_Script_EN_ZH.docx
+++ b/presentation/Little_Rascal_Speaker_Script_EN_ZH.docx
@@ -15,14 +15,12 @@
         <w:pStyle w:val="Heading1"/>
       </w:pPr>
       <w:r>
-        <w:t>Presentation script / 逐页讲稿</w:t>
+        <w:t>Reflection script / 反思演讲稿</w:t>
       </w:r>
     </w:p>
     <w:p>
       <w:r>
-        <w:t>English slides + English narration + Chinese rehearsal translation.</w:t>
-        <w:br/>
-        <w:t>English narration: approximately 808 words. Plan for 6½–7½ minutes of speech plus a two-minute edited demonstration; rehearse to remain under ten minutes.</w:t>
+        <w:t>16 slides: 14 main slides + 2 reference/disclosure appendices. English narration: 1032 words, including the demo narration. Planned total: 9:47, including a 2-minute edited demonstration. Chinese is for rehearsal only.</w:t>
       </w:r>
     </w:p>
     <w:p>
@@ -30,7 +28,7 @@
         <w:pStyle w:val="Heading2"/>
       </w:pPr>
       <w:r>
-        <w:t>使用说明</w:t>
+        <w:t>这次修改的重点</w:t>
       </w:r>
     </w:p>
     <w:p>
@@ -38,7 +36,7 @@
         <w:pStyle w:val="ListBullet"/>
       </w:pPr>
       <w:r>
-        <w:t>中文用于理解和排练，录制英文讲解时不用把两种语言各念一遍。</w:t>
+        <w:t>已对照上传的 Assignment Two brief（5页）及rubric（1页），不再依据聊天中的要求摘要。</w:t>
       </w:r>
     </w:p>
     <w:p>
@@ -46,7 +44,7 @@
         <w:pStyle w:val="ListBullet"/>
       </w:pPr>
       <w:r>
-        <w:t>PPT 的备注区已放入逐页英文稿和中文对照，可在演讲者视图查看。</w:t>
+        <w:t>老师多次明确总视频为8–10分钟；第3页另写演示约2分钟、反思约8分钟。因此以总长不超过10分钟为准，约2分钟演示＋7分36秒讲解，按实际语速排练。</w:t>
       </w:r>
     </w:p>
     <w:p>
@@ -54,7 +52,7 @@
         <w:pStyle w:val="ListBullet"/>
       </w:pPr>
       <w:r>
-        <w:t>演示页提供两分钟分镜；可以剪接阶段画面，但请明确标注剪接，不要把预览画面称为观众测试。</w:t>
+        <w:t>从功能介绍改为设计反思：展览发现过程、前后对比、修改原因、代价和下一步验证。</w:t>
       </w:r>
     </w:p>
     <w:p>
@@ -62,7 +60,7 @@
         <w:pStyle w:val="ListBullet"/>
       </w:pPr>
       <w:r>
-        <w:t>本稿依据已完成游戏和开发记录整理。个人反思、真实观众反馈、同学评价由你按实际经历补充；不应把草稿当作亲身经历直接照读。</w:t>
+        <w:t>第一人称内容依据你的实际修改要求整理；个人分析只是编辑草稿，请逐句核实并用自己的话表达，不应让AI代替自己的反思。</w:t>
       </w:r>
     </w:p>
     <w:p>
@@ -70,7 +68,7 @@
         <w:pStyle w:val="ListBullet"/>
       </w:pPr>
       <w:r>
-        <w:t>作业的 8–10 分钟时长来自之前聊天整理，未核对原始 rubric；最终以老师发布的要求为准。</w:t>
+        <w:t>依据你补充的真实同学建议、老师意见及本人试玩整理；不编造人数、逐字引语、展览经历或观众情绪。</w:t>
       </w:r>
     </w:p>
     <w:p>
@@ -78,26 +76,14 @@
         <w:pStyle w:val="ListBullet"/>
       </w:pPr>
       <w:r>
-        <w:t>本文件使用普通描述性文件名。若提交要求含姓名和学号，请按正式命名规则自行填写；不要虚填姓名、学号或测试数据。</w:t>
-      </w:r>
-    </w:p>
-    <w:p>
-      <w:pPr>
-        <w:pStyle w:val="Heading2"/>
-      </w:pPr>
-      <w:r>
-        <w:t>Game links</w:t>
+        <w:t>这次只更新展示材料，没有改变游戏代码、玩法、数值或美术。</w:t>
       </w:r>
     </w:p>
     <w:p>
       <w:r>
-        <w:t>Full game: https://itsangelia.github.io/little-rascal/?v=d3ab74f</w:t>
+        <w:t>Current game: https://itsangelia.github.io/little-rascal/?v=d3ab74f</w:t>
         <w:br/>
-        <w:t>Youth preview: https://itsangelia.github.io/little-rascal/previews/youth/?v=d3ab74f</w:t>
-        <w:br/>
-        <w:t>Senior preview: https://itsangelia.github.io/little-rascal/previews/elder/?v=d3ab74f</w:t>
-        <w:br/>
-        <w:t>Farewell preview: https://itsangelia.github.io/little-rascal/previews/farewell/?v=d3ab74f</w:t>
+        <w:t>Source files: https://github.com/itsangelia/little-rascal</w:t>
       </w:r>
     </w:p>
     <w:p>
@@ -118,7 +104,7 @@
         <w:pStyle w:val="Subtitle"/>
       </w:pPr>
       <w:r>
-        <w:t>Suggested time / 建议用时: 22 seconds</w:t>
+        <w:t>Suggested duration / 建议用时: 26 seconds</w:t>
       </w:r>
     </w:p>
     <w:p>
@@ -126,12 +112,12 @@
         <w:pStyle w:val="Heading2"/>
       </w:pPr>
       <w:r>
-        <w:t>English narration</w:t>
+        <w:t>English — spoken</w:t>
       </w:r>
     </w:p>
     <w:p>
       <w:r>
-        <w:t>Hello. Today I’m presenting Little Rascal, a browser-based virtual pet made with p5.js. The player cares for a small, star-topped character through childhood, youth and old age. My central design question is how everyday interaction can create a sense of attachment.</w:t>
+        <w:t>Little Rascal is a virtual pet game made with p5.js. You meet a small creature, care for it, and eventually say goodbye. I wanted a changing relationship, with real consequences: the pet can die if it is neglected. That risk is intended to make care feel like a responsibility and a challenge.</w:t>
       </w:r>
     </w:p>
     <w:p>
@@ -139,12 +125,12 @@
         <w:pStyle w:val="Heading2"/>
       </w:pPr>
       <w:r>
-        <w:t>中文对照</w:t>
+        <w:t>中文对照 — 不另读</w:t>
       </w:r>
     </w:p>
     <w:p>
       <w:r>
-        <w:t>大家好，今天我介绍的项目是 Little Rascal，一个使用 p5.js 制作的网页虚拟宠物游戏。玩家照顾一只头顶星星的小球，陪它经历幼年、青年和老年。我想探索的核心问题是：日常互动如何建立情感依恋？</w:t>
+        <w:t>Little Rascal 是我用 p5.js 制作的虚拟宠物游戏。你会认识一只小球，照顾它，最后和它告别。我希望这段关系会变化，照顾也有真实的后果：疏于照顾，宠物可能会死。这种风险是我有意加入的，希望玩家感到责任，也感到挑战。</w:t>
       </w:r>
     </w:p>
     <w:p>
@@ -157,7 +143,7 @@
         <w:pStyle w:val="Heading1"/>
       </w:pPr>
       <w:r>
-        <w:t>02  Can small acts of care create attachment?</w:t>
+        <w:t>02  What does a visitor notice first?</w:t>
       </w:r>
     </w:p>
     <w:p>
@@ -165,7 +151,7 @@
         <w:pStyle w:val="Subtitle"/>
       </w:pPr>
       <w:r>
-        <w:t>Suggested time / 建议用时: 38 seconds</w:t>
+        <w:t>Suggested duration / 建议用时: 33 seconds</w:t>
       </w:r>
     </w:p>
     <w:p>
@@ -173,12 +159,12 @@
         <w:pStyle w:val="Heading2"/>
       </w:pPr>
       <w:r>
-        <w:t>English narration</w:t>
+        <w:t>English — spoken</w:t>
       </w:r>
     </w:p>
     <w:p>
       <w:r>
-        <w:t>The game asks the player to notice another character’s needs, rather than simply collect points. Hunger, mood and energy create reasons to return to feeding, affection, play and rest. These actions are familiar, but their meaning changes as the pet grows. The intended emotional journey moves from curiosity and affection to responsibility, then farewell. This is a design intention; it has not yet been established through a formal audience study.</w:t>
+        <w:t>For an exhibition, I would present it on a computer with a mouse and headphones. That is the proposed setup, not a documented exhibition. The egg gently rocks before the first click. After the arrival animation, the player gives the pet a name. A short guide introduces care. The moving egg invites a first action, but the toy is less obvious: someone could still mistake it for decoration.</w:t>
       </w:r>
     </w:p>
     <w:p>
@@ -186,12 +172,25 @@
         <w:pStyle w:val="Heading2"/>
       </w:pPr>
       <w:r>
-        <w:t>中文对照</w:t>
+        <w:t>中文对照 — 不另读</w:t>
       </w:r>
     </w:p>
     <w:p>
       <w:r>
-        <w:t>游戏希望玩家留意另一个角色的需要，而不只是积累分数。饥饿、心情和能量，让喂食、抚摸、玩耍和休息都有了理由。这些行为很熟悉，但随着宠物成长，它们的意义会改变。我希望玩家从好奇和喜爱，逐步走向责任感，最终经历告别。这是我的设计目标，目前还没有通过正式的受众研究验证。</w:t>
+        <w:t>如果放在展览里，我会用一台配鼠标和耳机的电脑展示。这是预想的展览设置，不是已经记录过的展览现场。第一次点击之前，蛋会轻轻晃动。出场动画后，玩家给小球起名，再通过简短说明了解照顾方式。晃动的蛋能暗示第一次操作，但玩具球还不够明确：第一次玩的观众可能会以为它只是装饰。</w:t>
+      </w:r>
+    </w:p>
+    <w:p>
+      <w:pPr>
+        <w:pStyle w:val="Heading2"/>
+      </w:pPr>
+      <w:r>
+        <w:t>Recording cue / 核实与操作提示</w:t>
+      </w:r>
+    </w:p>
+    <w:p>
+      <w:r>
+        <w:t>展示形式为拟定方案。当前没有展览现场照片或观众记录。录屏须保留实际点击、拖拽与角色反应。</w:t>
       </w:r>
     </w:p>
     <w:p>
@@ -204,7 +203,7 @@
         <w:pStyle w:val="Heading1"/>
       </w:pPr>
       <w:r>
-        <w:t>03  Three layers of connection</w:t>
+        <w:t>03  Two minutes inside the room</w:t>
       </w:r>
     </w:p>
     <w:p>
@@ -212,7 +211,7 @@
         <w:pStyle w:val="Subtitle"/>
       </w:pPr>
       <w:r>
-        <w:t>Suggested time / 建议用时: 42 seconds</w:t>
+        <w:t>Suggested duration / 建议用时: 120 seconds</w:t>
       </w:r>
     </w:p>
     <w:p>
@@ -220,12 +219,12 @@
         <w:pStyle w:val="Heading2"/>
       </w:pPr>
       <w:r>
-        <w:t>English narration</w:t>
+        <w:t>English — spoken</w:t>
       </w:r>
     </w:p>
     <w:p>
       <w:r>
-        <w:t>Norman’s three levels of emotional design provide a useful way to discuss the project. At the visceral level, the soft watercolor room and simple face invite attention. At the behavioural level, clear needs and responsive actions help the player understand what to do. At the reflective level, aging and the final letter give those earlier actions a different meaning. These are my applications of the framework, rather than evidence that every player will respond in the same way.</w:t>
+        <w:t>First, I click the egg and give the pet a name. Here, I can feed it, pet it, or throw the toy. Notice that the kick happens when they meet. I have cut between life stages to show the full sequence. In old age, it pauses to rest and asks for affection. After the farewell, the player chooses when to open the letter.</w:t>
       </w:r>
     </w:p>
     <w:p>
@@ -233,12 +232,12 @@
         <w:pStyle w:val="Heading2"/>
       </w:pPr>
       <w:r>
-        <w:t>中文对照</w:t>
+        <w:t>中文对照 — 不另读</w:t>
       </w:r>
     </w:p>
     <w:p>
       <w:r>
-        <w:t>诺曼提出的情感设计三个层次，为讨论这个项目提供了一个框架。在本能层面，柔和的水彩房间和简洁的表情吸引注意力。在行为层面，清晰的需求和及时的反馈帮助玩家理解操作。在反思层面，衰老和最后的感谢信，让之前的照顾产生新的意义。这是我对理论的应用，并不代表每一位玩家都会产生相同的情绪。</w:t>
+        <w:t>首先，我点击蛋，给它起名。在这里，我可以喂食、摸摸，或者扔出玩具。注意，踢球是在它们碰到时发生的。我剪接了不同成长阶段，方便展示完整流程。到了老年，它会停下来休息，也会表达想被摸摸的需要。告别后，由玩家决定什么时候打开信。</w:t>
       </w:r>
     </w:p>
     <w:p>
@@ -246,12 +245,12 @@
         <w:pStyle w:val="Heading2"/>
       </w:pPr>
       <w:r>
-        <w:t>Presentation cue / 操作提示</w:t>
+        <w:t>Recording cue / 核实与操作提示</w:t>
       </w:r>
     </w:p>
     <w:p>
       <w:r>
-        <w:t>Framework source: Norman, D. A. (2004). Emotional Design. Describe this as the designer’s interpretation, not measured audience outcomes.</w:t>
+        <w:t>本页预留120秒实际录屏，尚未嵌入视频。英文口播包含在这120秒内，不另加时。00:00–00:25 点击蛋/流星/起名；00:25–00:55 喂食/摸摸/拖球并踢中；00:55–01:20 青年拒绝与状态变化；01:20–02:00 老年休息/气泡/消散/点击信封/新蛋。明确标注“Edited walkthrough · cuts between life stages”。可以剪接你自己录制的画面，不能当作观众测试录像。</w:t>
       </w:r>
     </w:p>
     <w:p>
@@ -264,7 +263,7 @@
         <w:pStyle w:val="Heading1"/>
       </w:pPr>
       <w:r>
-        <w:t>04  From a first meeting to a new beginning</w:t>
+        <w:t>04  Why care might become attachment</w:t>
       </w:r>
     </w:p>
     <w:p>
@@ -272,7 +271,7 @@
         <w:pStyle w:val="Subtitle"/>
       </w:pPr>
       <w:r>
-        <w:t>Suggested time / 建议用时: 44 seconds</w:t>
+        <w:t>Suggested duration / 建议用时: 37 seconds</w:t>
       </w:r>
     </w:p>
     <w:p>
@@ -280,12 +279,12 @@
         <w:pStyle w:val="Heading2"/>
       </w:pPr>
       <w:r>
-        <w:t>English narration</w:t>
+        <w:t>English — spoken</w:t>
       </w:r>
     </w:p>
     <w:p>
       <w:r>
-        <w:t>The experience begins with a gently moving egg. Clicking it triggers a shooting-star arrival, naming and a short guide. Naming gives the player a personal entry into the relationship. Childhood growth now requires three effective feeds and three petting actions, followed by the next sleep and waking. Below thirty energy, the little one automatically goes to bed. Sleep remains visible for at least three seconds and restores energy before waking. The final farewell leads back to an egg, so the life cycle can begin again.</w:t>
+        <w:t>Norman’s framework helps me explain three parts of the experience. The watercolor room and simple face are the first, visceral invitation. At the behavioural level, care has a readable response: a smile, a refusal, or a kick. Reflection comes through the life cycle: birth, growth, aging, farewell and a new egg. The letter recalls one relationship; the next egg invites another. I am aiming for affection and gentle loss, without claiming those emotions have been measured.</w:t>
       </w:r>
     </w:p>
     <w:p>
@@ -293,12 +292,12 @@
         <w:pStyle w:val="Heading2"/>
       </w:pPr>
       <w:r>
-        <w:t>中文对照</w:t>
+        <w:t>中文对照 — 不另读</w:t>
       </w:r>
     </w:p>
     <w:p>
       <w:r>
-        <w:t>体验从一颗轻轻晃动的蛋开始。点击后出现流星出场、起名和简短说明。起名让玩家更个人化地进入这段关系。现在，幼儿期需要累计三次有效喂食和三次摸摸，再在下一次睡醒后长大。能量低于三十时，幼儿会自动去睡觉。睡眠至少有三秒可见过程，并恢复能量后醒来。最后的告别会回到新蛋，开始下一轮生命。</w:t>
+        <w:t>诺曼的框架帮助我解释体验的三个部分。水彩房间和简单的脸，构成第一眼的本能吸引。在行为层面，照顾会得到看得懂的回应：微笑、拒绝，或踢球。反思则来自生命循环：出生、成长、衰老、告别，再出现新蛋。感谢信回顾一段关系，新蛋邀请下一次相遇。我希望引起喜爱和温柔的失落，但不声称这些情感已经被测量。</w:t>
       </w:r>
     </w:p>
     <w:p>
@@ -306,12 +305,12 @@
         <w:pStyle w:val="Heading2"/>
       </w:pPr>
       <w:r>
-        <w:t>Presentation cue / 操作提示</w:t>
+        <w:t>Recording cue / 核实与操作提示</w:t>
       </w:r>
     </w:p>
     <w:p>
       <w:r>
-        <w:t>Child → Youth: 3 effective feeds (hunger ≤95, available for care) +3 accepted PET actions, then next completed sleep. PLAY, toy rewards and CLEAN do not replace childhood PET. Youth → Senior retains2 effective feeds+2 other care actions. Child auto-sleeps strictly below30 energy after current care/play; other stages retain≤8. At least3 visible seconds asleep AND energy≥80 to wake. Never show growth before waking.</w:t>
+        <w:t>理论：Norman (2004)。本页是基于理论的设计解释，不是测得的玩家情感结果。</w:t>
       </w:r>
     </w:p>
     <w:p>
@@ -324,7 +323,7 @@
         <w:pStyle w:val="Heading1"/>
       </w:pPr>
       <w:r>
-        <w:t>05  One character, three changing relationships</w:t>
+        <w:t>05  Four stages became three: a shorter visit</w:t>
       </w:r>
     </w:p>
     <w:p>
@@ -332,7 +331,7 @@
         <w:pStyle w:val="Subtitle"/>
       </w:pPr>
       <w:r>
-        <w:t>Suggested time / 建议用时: 39 seconds</w:t>
+        <w:t>Suggested duration / 建议用时: 38 seconds</w:t>
       </w:r>
     </w:p>
     <w:p>
@@ -340,12 +339,12 @@
         <w:pStyle w:val="Heading2"/>
       </w:pPr>
       <w:r>
-        <w:t>English narration</w:t>
+        <w:t>English — spoken</w:t>
       </w:r>
     </w:p>
     <w:p>
       <w:r>
-        <w:t>The released game has three stages: Little One, Youth and Senior. Childhood is more vocal, with occasional spontaneous humming during eligible idle time. Its feeding, petting and rest introduce responsibility. Youth adds independence through refusal and boredom. The senior keeps the recognizable stars, but moves in small hopping bursts with pauses to rest and asks for affection through a thought bubble. Changing behaviour and sound, as well as appearance, make the stages feel different.</w:t>
+        <w:t>I shortened the life cycle from four stages to three to address the time needed for a complete experience. Teenager and adult overlapped, so I combined them into Youth and kept the refusal behaviour there. Childhood now needs three useful feeds and three accepted pettings, then sleep and waking. Youth keeps two useful feeds and two other care actions before waking into old age. The shorter sequence keeps childhood, independence and aging, with one fewer transition to wait through.</w:t>
       </w:r>
     </w:p>
     <w:p>
@@ -353,12 +352,12 @@
         <w:pStyle w:val="Heading2"/>
       </w:pPr>
       <w:r>
-        <w:t>中文对照</w:t>
+        <w:t>中文对照 — 不另读</w:t>
       </w:r>
     </w:p>
     <w:p>
       <w:r>
-        <w:t>正式版共有幼年、青年和老年三个阶段。幼儿期会在空闲时偶尔自然哼哼，喂食、摸摸和休息让玩家建立照顾的责任感。青年通过拒绝和厌烦表现独立性。老年保留熟悉的星星外形，但以短跳和停顿表现衰老，并通过气泡请求抚摸。阶段差异来自行为、声音与外形的共同变化。</w:t>
+        <w:t>为了缩短一次完整体验需要的时间，我已经把四个阶段缩减成了三个。teenager 和 adult 的定位重叠，所以我把它们合并成青年，并把拒绝行为保留在那里。现在幼年需要三次有效喂食、三次接受的摸摸，再睡醒。青年保留两次有效喂食和两次其他照顾，再睡醒进入老年。缩短后的流程仍保留了幼年、独立和衰老，也减少了一次需要等待的过渡。</w:t>
       </w:r>
     </w:p>
     <w:p>
@@ -366,12 +365,12 @@
         <w:pStyle w:val="Heading2"/>
       </w:pPr>
       <w:r>
-        <w:t>Presentation cue / 操作提示</w:t>
+        <w:t>Recording cue / 核实与操作提示</w:t>
       </w:r>
     </w:p>
     <w:p>
       <w:r>
-        <w:t>Child humL:7–10 eligible idle seconds; Youth/Senior:10–18. Busy actions, distress, sleep, dialogs and hidden tabs pause/suppress humming. Childhood waste:24–36s ordinary scheduling;8–12s after meals. Other stages:18–30s /5–8.5s. Existing illness deadlines remain6s flies,13s fatal.</w:t>
+        <w:t>有效喂食需触发实际照顾计数；幼年玩球、清理不能代替摸摸。计数达标不会即时变形，必须在之后完成睡眠和醒来。青年内部代码键仍为adult。 缩减阶段是作者已经实施的时长优化，不应表述为尚未处理时长。完整流程受照顾速度、睡眠与玩家选择影响，没有统一固定总时长。</w:t>
       </w:r>
     </w:p>
     <w:p>
@@ -384,7 +383,7 @@
         <w:pStyle w:val="Heading1"/>
       </w:pPr>
       <w:r>
-        <w:t>06  Care is a conversation, not a command</w:t>
+        <w:t>06  Play needed a visible point of contact</w:t>
       </w:r>
     </w:p>
     <w:p>
@@ -392,7 +391,7 @@
         <w:pStyle w:val="Subtitle"/>
       </w:pPr>
       <w:r>
-        <w:t>Suggested time / 建议用时: 42 seconds</w:t>
+        <w:t>Suggested duration / 建议用时: 38 seconds</w:t>
       </w:r>
     </w:p>
     <w:p>
@@ -400,12 +399,12 @@
         <w:pStyle w:val="Heading2"/>
       </w:pPr>
       <w:r>
-        <w:t>English narration</w:t>
+        <w:t>English — spoken</w:t>
       </w:r>
     </w:p>
     <w:p>
       <w:r>
-        <w:t>Youth has a twenty-five percent baseline chance to refuse feeding, petting or play. Repeating an action, or offering something when the corresponding need is already full, can also produce an unimpressed response. The reactions have different body language: angry petting refusal can lead to a quick escape, while boredom keeps the pet still. Refused play can include kicking the ball away. The player must read the response and vary their care, instead of repeating one action indefinitely.</w:t>
+        <w:t>At first, playing was mainly a button. Putting a toy in the room gave the player something to pick up and throw. But my earlier chase looked strange: the pet seemed to follow the ball without touching it. I also found the running too fast. I asked for a slower approach and a small kick at contact. The important change was the sequence: throw, approach, touch, kick. The sound now happens on the kick, rather than when PLAY is selected.</w:t>
       </w:r>
     </w:p>
     <w:p>
@@ -413,12 +412,25 @@
         <w:pStyle w:val="Heading2"/>
       </w:pPr>
       <w:r>
-        <w:t>中文对照</w:t>
+        <w:t>中文对照 — 不另读</w:t>
       </w:r>
     </w:p>
     <w:p>
       <w:r>
-        <w:t>青年阶段对喂食、抚摸和玩耍有百分之二十五的基础拒绝概率。如果连续重复同一操作，或者对应需求已经满了，也可能出现无语表情。不同反应有不同的身体语言：生气地拒绝抚摸时可能快速跳开，厌烦时则原地不动。拒绝玩球时，还可能把球踢走。玩家需要观察反应并调整照顾方式，而不是无限重复一个操作。</w:t>
+        <w:t>一开始，玩耍主要依靠按钮。把玩具放进房间后，玩家有了可以拿起来、扔出去的东西。但是早期追球很奇怪：宠物像是在隔空跟着球，碰不到它。我还觉得追球太快，于是要求减慢接近速度，碰到时再轻轻踢出去。真正重要的变化是动作顺序：扔出、接近、接触、踢开。现在声音也发生在踢中时，而不是选中 PLAY 的瞬间。</w:t>
+      </w:r>
+    </w:p>
+    <w:p>
+      <w:pPr>
+        <w:pStyle w:val="Heading2"/>
+      </w:pPr>
+      <w:r>
+        <w:t>Recording cue / 核实与操作提示</w:t>
+      </w:r>
+    </w:p>
+    <w:p>
+      <w:r>
+        <w:t>“之前”文字依据本对话中的作者试玩反馈，不是伪造的旧版截图。右侧图片为当前游戏。正式录制建议保留鼠标、球和宠物同框。</w:t>
       </w:r>
     </w:p>
     <w:p>
@@ -431,7 +443,7 @@
         <w:pStyle w:val="Heading1"/>
       </w:pPr>
       <w:r>
-        <w:t>07  Let the pet show and voice its needs</w:t>
+        <w:t>07  Youth does not always say yes</w:t>
       </w:r>
     </w:p>
     <w:p>
@@ -439,7 +451,7 @@
         <w:pStyle w:val="Subtitle"/>
       </w:pPr>
       <w:r>
-        <w:t>Suggested time / 建议用时: 38 seconds</w:t>
+        <w:t>Suggested duration / 建议用时: 38 seconds</w:t>
       </w:r>
     </w:p>
     <w:p>
@@ -447,12 +459,12 @@
         <w:pStyle w:val="Heading2"/>
       </w:pPr>
       <w:r>
-        <w:t>English narration</w:t>
+        <w:t>English — spoken</w:t>
       </w:r>
     </w:p>
     <w:p>
       <w:r>
-        <w:t>The floor toy makes play physical. The player throws it, and the pet kicks only after contact. A short call follows the kick, making the timing clearer. Other recorded sounds distinguish accepted petting, anger and spontaneous humming. A crying cue plays once when crying begins, without looping. Hunger below thirty also changes the body into a flattened pose. This already visualizes a need beyond a bar. Expression, movement and sound work together to help the player understand the pet.</w:t>
+        <w:t>Youth can refuse feeding, petting or play, with a baseline chance of twenty-five percent. Repeated requests or a full need can produce a still, unimpressed response instead. I wanted it to feel less like a machine that always obeys. However, refusal can also look like a broken control. I revised reactions that lasted too long and kept comfort available when mood is critical. The remaining question is whether a new player reads the refusal as personality or as failure.</w:t>
       </w:r>
     </w:p>
     <w:p>
@@ -460,12 +472,12 @@
         <w:pStyle w:val="Heading2"/>
       </w:pPr>
       <w:r>
-        <w:t>中文对照</w:t>
+        <w:t>中文对照 — 不另读</w:t>
       </w:r>
     </w:p>
     <w:p>
       <w:r>
-        <w:t>地上的玩具让玩耍成为实际动作。玩家扔出球，宠物只有碰到球才会踢，踢中时的短叫声让反馈更清楚。其他原声分别用于接受摸摸、生气和自然哼哼。哭声只在开始哭泣时播放一次，不会在持续哭泣时循环。饥饿低于三十还会切换成饿扁形态，这已经是数值条之外的需求可视化。表情、动作与声音共同帮助玩家理解宠物。</w:t>
+        <w:t>青年对喂食、摸摸和玩耍有百分之二十五的基础拒绝概率。重复请求，或者对应数值已满时，也可能让它停在原地，露出无语脸。我不想让它像一台永远服从的机器。不过，拒绝也可能被误认为按钮坏了。我修正了持续过久的反应，并保留心情极低时能被安抚的摸摸。还需要验证的是，新玩家会把拒绝理解为性格，还是操作失败。</w:t>
       </w:r>
     </w:p>
     <w:p>
@@ -473,12 +485,12 @@
         <w:pStyle w:val="Heading2"/>
       </w:pPr>
       <w:r>
-        <w:t>Presentation cue / 操作提示</w:t>
+        <w:t>Recording cue / 核实与操作提示</w:t>
       </w:r>
     </w:p>
     <w:p>
       <w:r>
-        <w:t>Owner-approved audio: C accepted PET; B anger; A crying onset once per visible episode; D actual friendly toy-contact kick only; L spontaneous humming. Reusable native HTMLAudio playback preserves original pitch/speed. Speaker toggles BGM ONLY; pet effects remain enabled. Calls reduce BGM briefly and restore prior volume. Generic hunger/energy bubbles are not implemented; existing senior affection bubble remains.</w:t>
+        <w:t>基础随机概率不是所有情形的最终拒绝率：满值、重复与危急安抚存在优先级。无语扣3心情，愤怒扣5；不要说拒绝不会影响数值。</w:t>
       </w:r>
     </w:p>
     <w:p>
@@ -491,7 +503,7 @@
         <w:pStyle w:val="Heading1"/>
       </w:pPr>
       <w:r>
-        <w:t>08  A life in two minutes</w:t>
+        <w:t>08  Older, slower, and more attached</w:t>
       </w:r>
     </w:p>
     <w:p>
@@ -499,7 +511,7 @@
         <w:pStyle w:val="Subtitle"/>
       </w:pPr>
       <w:r>
-        <w:t>Suggested time / 建议用时: 140 seconds</w:t>
+        <w:t>Suggested duration / 建议用时: 38 seconds</w:t>
       </w:r>
     </w:p>
     <w:p>
@@ -507,12 +519,12 @@
         <w:pStyle w:val="Heading2"/>
       </w:pPr>
       <w:r>
-        <w:t>English narration</w:t>
+        <w:t>English — spoken</w:t>
       </w:r>
     </w:p>
     <w:p>
       <w:r>
-        <w:t>I’ll now show a two-minute edited walkthrough. It brings together the opening, everyday care, Youth reactions and the senior farewell. Some waiting and repeated care are shortened so the complete life cycle can be shown clearly.</w:t>
+        <w:t>Simply slowing the animation looked like playback at half speed. Grounded walking also lost its character. I kept its bounce: three small, slower hops, then about three seconds still. I removed self-initiated ball play, though it still responds to a thrown ball. More importantly, the older pet becomes more attached to the player. It actively asks to be petted through a bubble, three times across senior life. Where Youth sometimes pulls away, Senior asks the player to come closer.</w:t>
       </w:r>
     </w:p>
     <w:p>
@@ -520,12 +532,12 @@
         <w:pStyle w:val="Heading2"/>
       </w:pPr>
       <w:r>
-        <w:t>中文对照</w:t>
+        <w:t>中文对照 — 不另读</w:t>
       </w:r>
     </w:p>
     <w:p>
       <w:r>
-        <w:t>接下来展示一段两分钟的剪辑试玩，串联开场、日常照顾、青年反应以及老年告别。部分等待和重复照顾会缩短，方便清楚展示完整生命周期。</w:t>
+        <w:t>单纯放慢动画，看起来像把视频调成半速。改成贴地走路，也失去了小球的特点。我保留了弹跳：连续三次较小、较慢的跳跃，然后停住约三秒。我删掉了它自己主动玩球的行为，但玩家扔球时它仍然回应。更重要的是，老年的小球变得更依恋玩家。它会通过气泡主动请求摸摸，老年期间出现三次。青年有时会躲开，老年则主动希望玩家靠近。</w:t>
       </w:r>
     </w:p>
     <w:p>
@@ -533,57 +545,12 @@
         <w:pStyle w:val="Heading2"/>
       </w:pPr>
       <w:r>
-        <w:t>Presentation cue / 操作提示</w:t>
+        <w:t>Recording cue / 核实与操作提示</w:t>
       </w:r>
     </w:p>
     <w:p>
       <w:r>
-        <w:t>This is a planned 120-second edited gameplay demonstration, not audience-testing evidence. Prepare the actual recording separately. Spoken introduction ≈20 seconds; footage ≈120 seconds. Leave enough screen time to read the envelope/letter; use cuts or clearly marked time compression. Record current audio: C on accepted PET, D at contact, B on Youth anger; include one brief A crying onset and one L idle hum where possible. Show child3feed+3PET readiness and sleep/wake through clearly edited clips. The full life cycle is not claimed to fit uncut into120seconds.</w:t>
-      </w:r>
-    </w:p>
-    <w:p>
-      <w:pPr>
-        <w:pStyle w:val="Heading2"/>
-      </w:pPr>
-      <w:r>
-        <w:t>Two-minute recording plan</w:t>
-      </w:r>
-    </w:p>
-    <w:p>
-      <w:pPr>
-        <w:pStyle w:val="ListBullet"/>
-      </w:pPr>
-      <w:r>
-        <w:t>00:00–00:25  Click the egg, show meteor/hatching, and type a name.</w:t>
-      </w:r>
-    </w:p>
-    <w:p>
-      <w:pPr>
-        <w:pStyle w:val="ListBullet"/>
-      </w:pPr>
-      <w:r>
-        <w:t>00:25–00:55  Feed or pet; drag and throw the toy; show a contact kick.</w:t>
-      </w:r>
-    </w:p>
-    <w:p>
-      <w:pPr>
-        <w:pStyle w:val="ListBullet"/>
-      </w:pPr>
-      <w:r>
-        <w:t>00:55–01:25  Show Youth accepting, getting bored and refusing. Avoid repeated clicking that hides the response.</w:t>
-      </w:r>
-    </w:p>
-    <w:p>
-      <w:pPr>
-        <w:pStyle w:val="ListBullet"/>
-      </w:pPr>
-      <w:r>
-        <w:t>01:25–02:00  Show senior hops/rest and affection cue; cut to soul, clickable envelope, letter and new egg.</w:t>
-      </w:r>
-    </w:p>
-    <w:p>
-      <w:r>
-        <w:t>Use separate clips and visible cuts; these scenes cannot all be reached in two minutes of uninterrupted play. For an exhibition requirement, replace this walkthrough with actual permitted audience-interaction footage. Do not describe the staged screenshots as audience evidence.</w:t>
+        <w:t>气泡为漫画框、三个小圈、卡通小手与爱心；不是文字“想摸摸”。睡觉、弹窗、忙碌或危险状态会推迟出现，不能说固定每隔若干秒出现。 作者明确：主动请求摸摸表现老年更依恋玩家，不只是交互提示。属于角色行为设计，不等于观众依恋程度已测量。</w:t>
       </w:r>
     </w:p>
     <w:p>
@@ -596,7 +563,7 @@
         <w:pStyle w:val="Heading1"/>
       </w:pPr>
       <w:r>
-        <w:t>09  Let the player choose when to say goodbye</w:t>
+        <w:t>09  A body can explain what a bar cannot</w:t>
       </w:r>
     </w:p>
     <w:p>
@@ -604,7 +571,7 @@
         <w:pStyle w:val="Subtitle"/>
       </w:pPr>
       <w:r>
-        <w:t>Suggested time / 建议用时: 40 seconds</w:t>
+        <w:t>Suggested duration / 建议用时: 39 seconds</w:t>
       </w:r>
     </w:p>
     <w:p>
@@ -612,12 +579,12 @@
         <w:pStyle w:val="Heading2"/>
       </w:pPr>
       <w:r>
-        <w:t>English narration</w:t>
+        <w:t>English — spoken</w:t>
       </w:r>
     </w:p>
     <w:p>
       <w:r>
-        <w:t>Natural old age has a different ending from neglect. The senior pauses, gently softens and dissolves, then a winged soul rises into stars. An envelope appears on the cleared floor. The player chooses when to open it and when to close the thank-you letter. That pause is important to the intended emotional rhythm. Only after closing the letter does starlight gather into a new egg. Neglect deaths retain a separate result screen.</w:t>
+        <w:t>My tutor suggested adding sound and making needs more visible, including through bubbles. Peer feedback also called for background music, more engaging toy play and richer expressions. I developed the flattened hungry pose below thirty: the bar shows how much is left, while the body shows how hunger feels. The senior bubble asks for affection; not every need has a bubble. I recorded the pet’s voice and selected calls for petting, anger, crying, kicking and idle humming. Crying plays once on entry.</w:t>
       </w:r>
     </w:p>
     <w:p>
@@ -625,12 +592,25 @@
         <w:pStyle w:val="Heading2"/>
       </w:pPr>
       <w:r>
-        <w:t>中文对照</w:t>
+        <w:t>中文对照 — 不另读</w:t>
       </w:r>
     </w:p>
     <w:p>
       <w:r>
-        <w:t>自然老死和照顾不周有不同的结局。老年球球先停下来，身体轻轻瘫软并消散，然后带翅膀的灵魂上升，散成星星。清空的地面上出现信封。玩家自己决定何时打开信封，以及何时关闭感谢信。这个停顿服务于我想设计的情绪节奏。只有关闭信后，星光才会汇聚成新蛋。照顾不周导致的死亡仍然使用独立的结算界面。</w:t>
+        <w:t>老师建议补充声音，并让状态更直观，比如使用气泡。同学也提出了加入背景音乐、增强玩具互动和丰富表情的建议。我完善了饥饿低于三十时饿扁的状态：数值条显示还剩多少，身体表现饥饿的感觉。老年气泡表达的是想被摸摸，并不是每个需求都有气泡。我录制了小球的声音，选出用于摸摸、生气、哭泣、踢球和自然哼哼的片段。哭声只在进入哭泣时播放一次。</w:t>
+      </w:r>
+    </w:p>
+    <w:p>
+      <w:pPr>
+        <w:pStyle w:val="Heading2"/>
+      </w:pPr>
+      <w:r>
+        <w:t>Recording cue / 核实与操作提示</w:t>
+      </w:r>
+    </w:p>
+    <w:p>
+      <w:r>
+        <w:t>反馈依据：作者在本对话中回忆同学提出背景音乐、增强玩具互动、丰富表情及饿扁状态；老师建议增加音效及状态可视化。属于作者报告的定性反馈，没有参与人数、录音逐字引语或正式研究。作者确认叫声为本人录制。BGM来自Pixabay（按pixaboy理解），音乐按钮只控制BGM。</w:t>
       </w:r>
     </w:p>
     <w:p>
@@ -643,7 +623,7 @@
         <w:pStyle w:val="Heading1"/>
       </w:pPr>
       <w:r>
-        <w:t>10  Build spatial movement with 2D tools</w:t>
+        <w:t>10  Farewell becomes a new beginning</w:t>
       </w:r>
     </w:p>
     <w:p>
@@ -651,7 +631,7 @@
         <w:pStyle w:val="Subtitle"/>
       </w:pPr>
       <w:r>
-        <w:t>Suggested time / 建议用时: 43 seconds</w:t>
+        <w:t>Suggested duration / 建议用时: 37 seconds</w:t>
       </w:r>
     </w:p>
     <w:p>
@@ -659,12 +639,12 @@
         <w:pStyle w:val="Heading2"/>
       </w:pPr>
       <w:r>
-        <w:t>English narration</w:t>
+        <w:t>English — spoken</w:t>
       </w:r>
     </w:p>
     <w:p>
       <w:r>
-        <w:t>The game uses two-dimensional programming with pseudo-three-dimensional movement. Ground position and jump height are separate; depth scaling, Y sorting and shadows create space. Internal coordinates remain nine hundred by six hundred and forty, with CSS window fitting and player-triggered fullscreen. Sound uses reusable native audio players, matching the audition page. Recorded clips retain their original pitch and speed. The speaker controls background music only, while pet calls remain audible. Browser gesture handling and playback checks support reliable interaction.</w:t>
+        <w:t>For natural old age, I replaced the abrupt result screen with a slower farewell. The pet pauses, softens and dissolves; its soul rises into stars. A gently moving envelope waits for a click, so the player chooses when to read the letter. Closing it gathers starlight into a new egg. This completes the life cycle: one relationship ends and another can begin. Neglect deaths keep the earlier result screen and restart; they do not receive this thank-you letter.</w:t>
       </w:r>
     </w:p>
     <w:p>
@@ -672,12 +652,12 @@
         <w:pStyle w:val="Heading2"/>
       </w:pPr>
       <w:r>
-        <w:t>中文对照</w:t>
+        <w:t>中文对照 — 不另读</w:t>
       </w:r>
     </w:p>
     <w:p>
       <w:r>
-        <w:t>游戏使用二维编程实现伪三维运动。地面位置与跳跃高度分开计算，再用远近缩放、按地面位置排序和阴影营造空间。内部坐标保持九百乘六百四十，通过 CSS 适配窗口，并由玩家主动点击全屏。声音改用与试听页相同的原生音频播放器，保留原声的音调与速度。扬声器只控制背景音乐，宠物叫声继续保留。手势启动处理与播放检查帮助保障互动反馈。</w:t>
+        <w:t>自然老死的部分，我把突然出现的结算画面改成了缓慢告别。小球停下、身体软下来并消散，灵魂升起化成星星。轻轻晃动的信封等待点击，让玩家决定什么时候读信。关闭信后，星光汇成新的蛋。生命循环由此完成：一段关系结束，另一段可以开始。疏于照顾导致的死亡仍保留原来的结算与重新开始，不会收到这封感谢信。</w:t>
       </w:r>
     </w:p>
     <w:p>
@@ -685,12 +665,12 @@
         <w:pStyle w:val="Heading2"/>
       </w:pPr>
       <w:r>
-        <w:t>Presentation cue / 操作提示</w:t>
+        <w:t>Recording cue / 核实与操作提示</w:t>
       </w:r>
     </w:p>
     <w:p>
       <w:r>
-        <w:t>Release d3ab74f. Main scripts: sketch.js care/growth/child sleep; sound-effects.js reusable HTMLAudio, silent gesture warmups, priority and one-shot cues; music.js BGM-only toggle. Native FX volume.9, idle65% relative; BGM briefly ducks to≤.135 then restores without toggling/starting music. p5.sound add-ons are no longer required. Fixed internal coordinates and native input/fullscreen alignment preserved.</w:t>
+        <w:t>自然离世通常从进入老年起累计80秒可见活跃时间；忙碌、三次需求气泡等可延后。可剪辑但不可声称完整生命周期只有80秒。感谢信原文不改。</w:t>
       </w:r>
     </w:p>
     <w:p>
@@ -703,7 +683,7 @@
         <w:pStyle w:val="Heading1"/>
       </w:pPr>
       <w:r>
-        <w:t>11  Make each reaction feel intentional</w:t>
+        <w:t>11  What the feedback actually tells me</w:t>
       </w:r>
     </w:p>
     <w:p>
@@ -711,7 +691,7 @@
         <w:pStyle w:val="Subtitle"/>
       </w:pPr>
       <w:r>
-        <w:t>Suggested time / 建议用时: 42 seconds</w:t>
+        <w:t>Suggested duration / 建议用时: 40 seconds</w:t>
       </w:r>
     </w:p>
     <w:p>
@@ -719,12 +699,12 @@
         <w:pStyle w:val="Heading2"/>
       </w:pPr>
       <w:r>
-        <w:t>English narration</w:t>
+        <w:t>English — spoken</w:t>
       </w:r>
     </w:p>
     <w:p>
       <w:r>
-        <w:t>Designer-led iteration improved contact-timed kicks, senior hops and rest, the watercolor interface, and the three-stage life cycle. Recent changes make childhood growth depend on three feeds and three petting actions, followed by waking, and trigger automatic sleep below thirty energy. Sound was also revised: native playback and mixing checks replaced a fragile audio path. Browser checks verify these behaviours, but do not establish emotional effectiveness. Real audience feedback, saved progress and accessibility remain future work.</w:t>
+        <w:t>Peer suggestions helped me move beyond a cute character on screen: background music, a toy that feels more interactive, and clearer expressions. My own playthroughs then exposed more specific problems, including disconnected pursuit, slow-motion aging and a rushed hatch. I revised those details, while tutor advice focused my attention on sound and readable needs. These are useful development observations, not a controlled audience study. I can explain what changed, but I cannot yet claim that the final version creates attachment for every player.</w:t>
       </w:r>
     </w:p>
     <w:p>
@@ -732,12 +712,12 @@
         <w:pStyle w:val="Heading2"/>
       </w:pPr>
       <w:r>
-        <w:t>中文对照</w:t>
+        <w:t>中文对照 — 不另读</w:t>
       </w:r>
     </w:p>
     <w:p>
       <w:r>
-        <w:t>设计者主导的迭代改进了接触后踢球、老年的跳动与休息、水彩界面和三阶段生命周期。最近把幼儿成长改为三次有效喂食加三次摸摸后睡醒，并加入能量低于三十的自动睡眠。音频也经过调整：改用原生播放，并检查与背景音乐同时播放时的表现。浏览器检查验证行为，但不能证明情感效果。真实受众反馈、进度保存和可访问性仍是未来方向。</w:t>
+        <w:t>同学的建议推动我把作品从屏幕上的可爱角色往前推进：加入背景音乐、让玩具更有互动性、让表情更清楚。自己的反复试玩又暴露出更具体的问题，包括隔空追球、像慢放一样的衰老，以及太快的孵化过程。我修改了这些细节；老师的建议则让我更关注声音和状态是否可读。这些是有用的开发观察，不是受控的受众研究。我能说明改了什么，但还不能声称最终版本会让所有玩家产生依恋。</w:t>
       </w:r>
     </w:p>
     <w:p>
@@ -745,12 +725,12 @@
         <w:pStyle w:val="Heading2"/>
       </w:pPr>
       <w:r>
-        <w:t>Presentation cue / 操作提示</w:t>
+        <w:t>Recording cue / 核实与操作提示</w:t>
       </w:r>
     </w:p>
     <w:p>
       <w:r>
-        <w:t>Implemented: childhood3feed+3PET then waking, auto-bed&lt;30, hum7–10eligible seconds, ordinary waste24–36s and meal8–12s; owner-selected C/B/A/D/L audio; native playback checked with BGM active, not only with music muted. No formal audience study or measured emotional-effectiveness claims. Keep prior fixed-canvas/CSS adaptation explanation accurate.</w:t>
+        <w:t>基于作者报告的同学反馈、自己的试玩及老师意见。不得增添测试人数、姓名、伪造引语或已举办展览的说法。brief还要求给至少一名同学建设性反馈；作者尚未提供这一方向的具体经历，提交前补入真实记录。</w:t>
       </w:r>
     </w:p>
     <w:p>
@@ -763,7 +743,7 @@
         <w:pStyle w:val="Heading1"/>
       </w:pPr>
       <w:r>
-        <w:t>12  A relationship built from small interactions</w:t>
+        <w:t>12  Consequences are part of caring</w:t>
       </w:r>
     </w:p>
     <w:p>
@@ -771,7 +751,7 @@
         <w:pStyle w:val="Subtitle"/>
       </w:pPr>
       <w:r>
-        <w:t>Suggested time / 建议用时: 24 seconds</w:t>
+        <w:t>Suggested duration / 建议用时: 41 seconds</w:t>
       </w:r>
     </w:p>
     <w:p>
@@ -779,12 +759,12 @@
         <w:pStyle w:val="Heading2"/>
       </w:pPr>
       <w:r>
-        <w:t>English narration</w:t>
+        <w:t>English — spoken</w:t>
       </w:r>
     </w:p>
     <w:p>
       <w:r>
-        <w:t>Little Rascal brings everyday care, changing personality and a complete life cycle into one small room. Its main contribution is the connection between behaviour and emotional meaning. The next challenge is to test that intention with real players. Thank you for watching.</w:t>
+        <w:t>Death is intentional. If the pet could never die from neglect, keeping it alive would carry less responsibility and challenge. Waste smells after six seconds and can cause illness death at thirteen; hunger or mood at zero for eight seconds can also be fatal. These consequences make attention matter. The question is whether a first-time player can understand the warning and respond fairly. I want to keep the challenge, while testing clearer cues and enough recovery time. Natural old age offers a different kind of ending.</w:t>
       </w:r>
     </w:p>
     <w:p>
@@ -792,12 +772,12 @@
         <w:pStyle w:val="Heading2"/>
       </w:pPr>
       <w:r>
-        <w:t>中文对照</w:t>
+        <w:t>中文对照 — 不另读</w:t>
       </w:r>
     </w:p>
     <w:p>
       <w:r>
-        <w:t>Little Rascal 把日常照顾、变化的性格和完整生命周期，放进了一个小小的房间。这个项目的重点，是连接行为与情感意义。下一步的挑战是通过真实玩家验证这个设计目标。谢谢观看。</w:t>
+        <w:t>死亡是我有意加入的。如果怎么疏于照顾都不会死，养活它就少了责任感和挑战。粑粑六秒开始发臭，十三秒可能病死；饥饿或心情归零持续八秒也会致死。这些后果让关注和照顾变得重要。需要验证的是，第一次玩的玩家能否理解警告，并有公平的时间回应。我想保留挑战，同时测试更清楚的提示和足够的挽救时间。自然老死则提供了另一种结尾。</w:t>
       </w:r>
     </w:p>
     <w:p>
@@ -805,12 +785,12 @@
         <w:pStyle w:val="Heading2"/>
       </w:pPr>
       <w:r>
-        <w:t>Presentation cue / 操作提示</w:t>
+        <w:t>Recording cue / 核实与操作提示</w:t>
       </w:r>
     </w:p>
     <w:p>
       <w:r>
-        <w:t>Playable game: https://itsangelia.github.io/little-rascal/?v=d3ab74f</w:t>
+        <w:t>作者明确说明死亡用于增加责任感和挑战性，不把死亡本身写成失误。13秒是每个粑粑从产生起的总时长；不是发臭后13秒。公平性属于待验证问题，不声称观众实际感到焦虑。</w:t>
       </w:r>
     </w:p>
     <w:p>
@@ -823,7 +803,7 @@
         <w:pStyle w:val="Heading1"/>
       </w:pPr>
       <w:r>
-        <w:t>13  References and production credits</w:t>
+        <w:t>13  What I would test next</w:t>
       </w:r>
     </w:p>
     <w:p>
@@ -831,7 +811,7 @@
         <w:pStyle w:val="Subtitle"/>
       </w:pPr>
       <w:r>
-        <w:t>Suggested time / 建议用时: 0 seconds</w:t>
+        <w:t>Suggested duration / 建议用时: 37 seconds</w:t>
       </w:r>
     </w:p>
     <w:p>
@@ -839,12 +819,12 @@
         <w:pStyle w:val="Heading2"/>
       </w:pPr>
       <w:r>
-        <w:t>English narration</w:t>
+        <w:t>English — spoken</w:t>
       </w:r>
     </w:p>
     <w:p>
       <w:r>
-        <w:t>This appendix records the design framework, technical library and production references. Before submission, confirm source and licence credits for the background music and uploaded voice recording, and complete the reference-game citation required by the course.</w:t>
+        <w:t>The four-to-three-stage change already shortens the visit. Next, I would check whether that revised length works for first-time players, rather than assume it does. Without coaching, do they discover dragging, understand a refusal and respond to warnings? I would compare clearer cues and slightly longer warning periods while keeping the possibility of death. Saved progress and separate voice controls remain future possibilities. The next version should build on the shorter cycle, not add stages back in.</w:t>
       </w:r>
     </w:p>
     <w:p>
@@ -852,12 +832,12 @@
         <w:pStyle w:val="Heading2"/>
       </w:pPr>
       <w:r>
-        <w:t>中文对照</w:t>
+        <w:t>中文对照 — 不另读</w:t>
       </w:r>
     </w:p>
     <w:p>
       <w:r>
-        <w:t>附录记录设计框架、技术库和制作参考。提交前请确认背景音乐与上传叫声音频的来源、使用许可，并按课程要求补全参考游戏引用。</w:t>
+        <w:t>从四阶段缩成三阶段，已经缩短了体验。下一步，我会验证这个调整后的长度是否适合第一次玩的玩家，而不是直接假定它已经合适。在没有指导时，他们会发现拖拽、理解拒绝并回应警告吗？我会比较更清楚的提示和稍长的警告期，同时保留死亡的可能性。存档与独立叫声控制仍是未来方向。下一版应该在缩短后的流程上完善，而不是再加回阶段。</w:t>
       </w:r>
     </w:p>
     <w:p>
@@ -865,12 +845,12 @@
         <w:pStyle w:val="Heading2"/>
       </w:pPr>
       <w:r>
-        <w:t>Presentation cue / 操作提示</w:t>
+        <w:t>Recording cue / 核实与操作提示</w:t>
       </w:r>
     </w:p>
     <w:p>
       <w:r>
-        <w:t>Credits must distinguish uploaded original illustrations from generated design explorations. Do not claim all assets are exclusively hand-drawn by the student. Confirm instructor requirements for AI disclosure. No formal audience study or participant metrics are claimed. Pet calls are edited excerpts from the owner-uploaded 提取的音频.m4a, not generated voices. Do not label them as self-recorded or royalty-free without verification.</w:t>
+        <w:t>这是未来测试计划，不是已完成研究。若实际补录试玩，请取得参与者同意，并保留具体观察和修改依据。</w:t>
       </w:r>
     </w:p>
     <w:p>
@@ -883,7 +863,340 @@
         <w:pStyle w:val="Heading1"/>
       </w:pPr>
       <w:r>
-        <w:t>Personal reflection — complete from your own experience</w:t>
+        <w:t>14  A little life, then another beginning</w:t>
+      </w:r>
+    </w:p>
+    <w:p>
+      <w:pPr>
+        <w:pStyle w:val="Subtitle"/>
+      </w:pPr>
+      <w:r>
+        <w:t>Suggested duration / 建议用时: 25 seconds</w:t>
+      </w:r>
+    </w:p>
+    <w:p>
+      <w:pPr>
+        <w:pStyle w:val="Heading2"/>
+      </w:pPr>
+      <w:r>
+        <w:t>English — spoken</w:t>
+      </w:r>
+    </w:p>
+    <w:p>
+      <w:r>
+        <w:t>Each stage changes the relationship: the little one needs care, Youth sometimes resists, and Senior asks for closeness. Death gives that care consequences. The new egg completes the cycle of birth, growth, farewell and renewal. I want the player to remember the life they cared for, even as another begins.</w:t>
+      </w:r>
+    </w:p>
+    <w:p>
+      <w:pPr>
+        <w:pStyle w:val="Heading2"/>
+      </w:pPr>
+      <w:r>
+        <w:t>中文对照 — 不另读</w:t>
+      </w:r>
+    </w:p>
+    <w:p>
+      <w:r>
+        <w:t>每个阶段都在改变这段关系：幼年需要照顾，青年有时拒绝，老年主动寻求陪伴。死亡让照顾有了后果。新的蛋完成了出生、成长、告别和新生的循环。我希望即使新的相遇开始，玩家也会记得自己曾经照顾过的这段生命。</w:t>
+      </w:r>
+    </w:p>
+    <w:p>
+      <w:pPr>
+        <w:pStyle w:val="Heading2"/>
+      </w:pPr>
+      <w:r>
+        <w:t>Recording cue / 核实与操作提示</w:t>
+      </w:r>
+    </w:p>
+    <w:p>
+      <w:r>
+        <w:t>生命循环是设计主题，不声称程序持久保存上一世记忆或名字，也不声称新蛋就是同一只宠物转生。新蛋重新进入既有出场、命名与照顾流程。</w:t>
+      </w:r>
+    </w:p>
+    <w:p>
+      <w:r>
+        <w:br w:type="page"/>
+      </w:r>
+    </w:p>
+    <w:p>
+      <w:pPr>
+        <w:pStyle w:val="Heading1"/>
+      </w:pPr>
+      <w:r>
+        <w:t>15  References &amp; source notes</w:t>
+      </w:r>
+    </w:p>
+    <w:p>
+      <w:pPr>
+        <w:pStyle w:val="Subtitle"/>
+      </w:pPr>
+      <w:r>
+        <w:t>Appendix / 不读</w:t>
+      </w:r>
+    </w:p>
+    <w:p>
+      <w:r>
+        <w:t>LITTLE RASCAL  /  EMOTIONAL INTERACTIONS</w:t>
+      </w:r>
+    </w:p>
+    <w:p>
+      <w:r>
+        <w:t>15</w:t>
+      </w:r>
+    </w:p>
+    <w:p>
+      <w:r>
+        <w:t>FRAMEWORK</w:t>
+      </w:r>
+    </w:p>
+    <w:p>
+      <w:r>
+        <w:t>Norman, D. A. (2004). Emotional design: Why we love (or hate) everyday things. Basic Books.</w:t>
+      </w:r>
+    </w:p>
+    <w:p>
+      <w:r>
+        <w:t>TECHNICAL LIBRARY</w:t>
+      </w:r>
+    </w:p>
+    <w:p>
+      <w:r>
+        <w:t>Processing Foundation. (n.d.). p5.js reference. https://p5js.org/reference/</w:t>
+      </w:r>
+    </w:p>
+    <w:p>
+      <w:r>
+        <w:t>ASSESSMENT</w:t>
+      </w:r>
+    </w:p>
+    <w:p>
+      <w:r>
+        <w:t>Curtin University. (n.d.). GRDE2040 Assignment Two: Emotional Interactions [brief]; A2 Playful Exhibition [rubric]. User-supplied course documents.</w:t>
+      </w:r>
+    </w:p>
+    <w:p>
+      <w:r>
+        <w:t>PLAY REFERENCE</w:t>
+      </w:r>
+    </w:p>
+    <w:p>
+      <w:r>
+        <w:t>My Lil’ Bastard — user-supplied gameplay video/screenshots. Publisher, year and exact source require confirmation.</w:t>
+      </w:r>
+    </w:p>
+    <w:p>
+      <w:r>
+        <w:t>PROJECT SOURCE</w:t>
+      </w:r>
+    </w:p>
+    <w:p>
+      <w:r>
+        <w:t>Little Rascal. Source: https://github.com/itsangelia/little-rascal</w:t>
+        <w:br/>
+        <w:t>Gameplay baseline: d3ab74f. Images show current staged game states, not audience footage.</w:t>
+      </w:r>
+    </w:p>
+    <w:p>
+      <w:r>
+        <w:t>MEDIA CREDITS</w:t>
+      </w:r>
+    </w:p>
+    <w:p>
+      <w:r>
+        <w:t>User-uploaded illustrations and AI-assisted visual iterations. BGM: Pixabay (designer-reported; track / artist / URL to add). Pet voice: recorded by the designer, then excerpted for the game.</w:t>
+      </w:r>
+    </w:p>
+    <w:p>
+      <w:r>
+        <w:t>Author–date draft: check the exact reference style required by the unit outline.</w:t>
+      </w:r>
+    </w:p>
+    <w:p>
+      <w:pPr>
+        <w:pStyle w:val="Heading2"/>
+      </w:pPr>
+      <w:r>
+        <w:t>Recording cue / 核实与操作提示</w:t>
+      </w:r>
+    </w:p>
+    <w:p>
+      <w:r>
+        <w:t>引用采用作者—年份草稿，最终按unit outline规定格式统一。老师已许可AI辅助（作者确认）。叫声为作者本人录制（作者确认）。BGM平台Pixabay（作者原写pixaboy），具体曲名/作者/下载链接待补。参考游戏发布信息仍待核实。</w:t>
+      </w:r>
+    </w:p>
+    <w:p>
+      <w:r>
+        <w:br w:type="page"/>
+      </w:r>
+    </w:p>
+    <w:p>
+      <w:pPr>
+        <w:pStyle w:val="Heading1"/>
+      </w:pPr>
+      <w:r>
+        <w:t>16  AI assistance &amp; submission record</w:t>
+      </w:r>
+    </w:p>
+    <w:p>
+      <w:pPr>
+        <w:pStyle w:val="Subtitle"/>
+      </w:pPr>
+      <w:r>
+        <w:t>Appendix / 不读</w:t>
+      </w:r>
+    </w:p>
+    <w:p>
+      <w:r>
+        <w:t>LITTLE RASCAL  /  EMOTIONAL INTERACTIONS</w:t>
+      </w:r>
+    </w:p>
+    <w:p>
+      <w:r>
+        <w:t>16</w:t>
+      </w:r>
+    </w:p>
+    <w:p>
+      <w:r>
+        <w:t>DRAFT DISCLOSURE · AUTHOR MUST VERIFY</w:t>
+      </w:r>
+    </w:p>
+    <w:p>
+      <w:r>
+        <w:t>OpenAI ChatGPT/Codex assisted with ideation, visual explorations, coding, debugging, audio excerpt processing, and editing slides and narration.</w:t>
+      </w:r>
+    </w:p>
+    <w:p>
+      <w:r>
+        <w:t>The designer confirms tutor approval for AI assistance. The record documents their selections, rejected options and repeated revisions. Personal analysis must be checked and expressed in their own words.</w:t>
+      </w:r>
+    </w:p>
+    <w:p>
+      <w:r>
+        <w:t>Submission checks</w:t>
+      </w:r>
+    </w:p>
+    <w:p>
+      <w:r>
+        <w:t>AI scope declaration · music track credit · feedback given to a peer</w:t>
+        <w:br/>
+        <w:t>Curtin cover sheet · video link + timestamp · source link · required filename</w:t>
+      </w:r>
+    </w:p>
+    <w:p>
+      <w:r>
+        <w:t>AI permission and voice authorship are designer-reported; no formal audience study is claimed.</w:t>
+      </w:r>
+    </w:p>
+    <w:p>
+      <w:pPr>
+        <w:pStyle w:val="Heading2"/>
+      </w:pPr>
+      <w:r>
+        <w:t>Recording cue / 核实与操作提示</w:t>
+      </w:r>
+    </w:p>
+    <w:p>
+      <w:r>
+        <w:t>作者确认已获老师许可使用AI辅助，叫声音频由本人录制，BGM来源为pixaboy（按Pixabay理解）。声明仍需作者核实实际范围并按课程规定签署；不得把这一确认写成助手独立验证的许可证。音乐曲名、作者及具体链接还未提供。brief要求反思自己给同学的反馈，目前未提供具体例子。</w:t>
+      </w:r>
+    </w:p>
+    <w:p>
+      <w:r>
+        <w:br w:type="page"/>
+      </w:r>
+    </w:p>
+    <w:p>
+      <w:pPr>
+        <w:pStyle w:val="Heading1"/>
+      </w:pPr>
+      <w:r>
+        <w:t>Assessment coverage / 对照老师要求</w:t>
+      </w:r>
+    </w:p>
+    <w:p>
+      <w:pPr>
+        <w:pStyle w:val="Heading2"/>
+      </w:pPr>
+      <w:r>
+        <w:t>Context /10</w:t>
+      </w:r>
+    </w:p>
+    <w:p>
+      <w:r>
+        <w:t>Slides 2–3: proposed encounter, first-click discovery, mouse/headphone setting; explicitly not a documented exhibition.</w:t>
+      </w:r>
+    </w:p>
+    <w:p>
+      <w:pPr>
+        <w:pStyle w:val="Heading2"/>
+      </w:pPr>
+      <w:r>
+        <w:t>Narrative &amp; interaction /25</w:t>
+      </w:r>
+    </w:p>
+    <w:p>
+      <w:r>
+        <w:t>Slides 3–7, 9–10: real input/response, growth conditions, resistance, visible needs and player-controlled farewell.</w:t>
+      </w:r>
+    </w:p>
+    <w:p>
+      <w:pPr>
+        <w:pStyle w:val="Heading2"/>
+      </w:pPr>
+      <w:r>
+        <w:t>Aesthetics &amp; creativity /25</w:t>
+      </w:r>
+    </w:p>
+    <w:p>
+      <w:r>
+        <w:t>Slides 4, 6, 8–10: Norman, physical contact, hop/rest rhythm, bodily hunger and a clickable envelope.</w:t>
+      </w:r>
+    </w:p>
+    <w:p>
+      <w:pPr>
+        <w:pStyle w:val="Heading2"/>
+      </w:pPr>
+      <w:r>
+        <w:t>Process &amp; feedback /15</w:t>
+      </w:r>
+    </w:p>
+    <w:p>
+      <w:r>
+        <w:t>Slides 5–11, 15–16: own iteration comparisons, tutor suggestions, sources and AI disclosure. Includes designer-reported peer suggestions; the designer’s feedback given to another student still needs documentation.</w:t>
+      </w:r>
+    </w:p>
+    <w:p>
+      <w:pPr>
+        <w:pStyle w:val="Heading2"/>
+      </w:pPr>
+      <w:r>
+        <w:t>Reflection &amp; communication /20</w:t>
+      </w:r>
+    </w:p>
+    <w:p>
+      <w:r>
+        <w:t>Slides 7, 11–14: misunderstanding risk, evidence limits, punitive timing, exhibition dwell time and a concrete future test plan.</w:t>
+      </w:r>
+    </w:p>
+    <w:p>
+      <w:pPr>
+        <w:pStyle w:val="Heading2"/>
+      </w:pPr>
+      <w:r>
+        <w:t>Milestone check-in /5</w:t>
+      </w:r>
+    </w:p>
+    <w:p>
+      <w:r>
+        <w:t>Rubric separately lists A2 Milestone Check-In. A final slide deck does not establish attendance, blog submission or feedback given to a peer.</w:t>
+      </w:r>
+    </w:p>
+    <w:p>
+      <w:pPr>
+        <w:pStyle w:val="Heading1"/>
+      </w:pPr>
+      <w:r>
+        <w:t>Before submission / 必须由你补齐</w:t>
       </w:r>
     </w:p>
     <w:p>
@@ -891,7 +1204,7 @@
         <w:pStyle w:val="ListBullet"/>
       </w:pPr>
       <w:r>
-        <w:t>What actually happened when someone else tried the game? Record who participated, what they did and what evidence you collected. Do not invent observations.</w:t>
+        <w:t>已纳入你报告的同学建议。按brief第3页要求，还需要记录你给至少一名同学的具体建设性反馈，并保留真实试玩观察。不要虚构参与人数或引语。</w:t>
       </w:r>
     </w:p>
     <w:p>
@@ -899,7 +1212,7 @@
         <w:pStyle w:val="ListBullet"/>
       </w:pPr>
       <w:r>
-        <w:t>Which change do you personally consider most successful, and why? Add your own honest reflection.</w:t>
+        <w:t>你已确认获得老师对AI辅助的许可。brief第2页与第4页仍要求：AI支持而非替代自己的思考，提交时附准确的实际使用声明。请核实声明范围。</w:t>
       </w:r>
     </w:p>
     <w:p>
@@ -907,7 +1220,7 @@
         <w:pStyle w:val="ListBullet"/>
       </w:pPr>
       <w:r>
-        <w:t>Where did a player misunderstand an interaction? Add an actual example only if you observed one.</w:t>
+        <w:t>叫声按你确认标为本人录制；背景音乐按Pixabay标注，补全曲名、作者及原下载链接（你写的是pixaboy，请核对平台拼写）。补全参考游戏信息，区分本人原画与AI辅助迭代素材。</w:t>
       </w:r>
     </w:p>
     <w:p>
@@ -915,7 +1228,7 @@
         <w:pStyle w:val="ListBullet"/>
       </w:pPr>
       <w:r>
-        <w:t>Which uploaded assets did you create yourself? Confirm ownership and give precise credits for other sources and AI assistance.</w:t>
+        <w:t>录制两分钟真实游戏演示并放入最终视频；当前PPT没有内嵌录像。整段排练在8–10分钟内，不用中英各读一次。</w:t>
       </w:r>
     </w:p>
     <w:p>
@@ -923,12 +1236,31 @@
         <w:pStyle w:val="ListBullet"/>
       </w:pPr>
       <w:r>
-        <w:t>Confirm bgm.mp3’s original source and licence, your course AI-disclosure requirements, and the exact assessment/presentation timing.</w:t>
+        <w:t>使用Curtin标准封面，在Declaration处填写本人姓名作为数字签名；封面模板、姓名与学号未提供，不能代填。</w:t>
       </w:r>
     </w:p>
     <w:p>
+      <w:pPr>
+        <w:pStyle w:val="ListBullet"/>
+      </w:pPr>
       <w:r>
-        <w:t>You can shorten the factual narration to make space for your own reflection. Never invent audience numbers, quotations or feedback. Confirm the music source/credit and required AI-use statement before submission.</w:t>
+        <w:t>写明不失效且公开可访问的视频链接，并附上传时间截图；同时提供清楚标注的工作文件/仓库链接。</w:t>
+      </w:r>
+    </w:p>
+    <w:p>
+      <w:pPr>
+        <w:pStyle w:val="ListBullet"/>
+      </w:pPr>
+      <w:r>
+        <w:t>提交文件名：A2_Surname_GivenName_StudentNumber_FileName。原始brief没有提供具体截止日期，只写Week13，按Blackboard确认。</w:t>
+      </w:r>
+    </w:p>
+    <w:p>
+      <w:pPr>
+        <w:pStyle w:val="ListBullet"/>
+      </w:pPr>
+      <w:r>
+        <w:t>按unit outline规定格式统一引用；这两份PDF没有指定APA/Chicago等具体格式，因此当前使用作者—年份草稿，不冒称完全符合某一种格式。</w:t>
       </w:r>
     </w:p>
     <w:sectPr>
@@ -950,7 +1282,7 @@
       <w:jc w:val="right"/>
     </w:pPr>
     <w:r>
-      <w:t xml:space="preserve">Little Rascal  |  Presentation script  |  </w:t>
+      <w:t xml:space="preserve">Little Rascal · Editorial revision · </w:t>
     </w:r>
     <w:fldSimple w:instr="PAGE"/>
   </w:p>
@@ -1321,11 +1653,11 @@
     <w:qFormat/>
     <w:rsid w:val="00FC693F"/>
     <w:pPr>
-      <w:spacing w:after="160"/>
+      <w:spacing w:after="140"/>
     </w:pPr>
     <w:rPr>
       <w:rFonts w:ascii="Arial" w:hAnsi="Arial" w:eastAsia="Noto Sans CJK SC"/>
-      <w:sz w:val="22"/>
+      <w:sz w:val="21"/>
     </w:rPr>
   </w:style>
   <w:style w:type="paragraph" w:styleId="Header">

</xml_diff>

<commit_message>
Merge strengths of presentation one into uploaded version two
</commit_message>
<xml_diff>
--- a/presentation/Little_Rascal_Speaker_Script_EN_ZH.docx
+++ b/presentation/Little_Rascal_Speaker_Script_EN_ZH.docx
@@ -20,7 +20,7 @@
     </w:p>
     <w:p>
       <w:r>
-        <w:t>16 slides: 14 main slides + 2 reference/disclosure appendices. English narration: 1032 words, including the demo narration. Planned total: 9:47, including a 2-minute edited demonstration. Chinese is for rehearsal only.</w:t>
+        <w:t>17 slides: 15 main slides + 2 reference/disclosure appendices. English narration: 1022 words, including the demo narration. Planned total: 9:43, including a 2-minute edited demonstration. Chinese is for rehearsal only.</w:t>
       </w:r>
     </w:p>
     <w:p>
@@ -28,7 +28,7 @@
         <w:pStyle w:val="Heading2"/>
       </w:pPr>
       <w:r>
-        <w:t>这次修改的重点</w:t>
+        <w:t>融合版本1与版本2的修改重点</w:t>
       </w:r>
     </w:p>
     <w:p>
@@ -36,7 +36,7 @@
         <w:pStyle w:val="ListBullet"/>
       </w:pPr>
       <w:r>
-        <w:t>已对照上传的 Assignment Two brief（5页）及rubric（1页），不再依据聊天中的要求摘要。</w:t>
+        <w:t>以你上传的（2）为实际底稿，保留其迭代与反思主线；吸收（1）的情感设问、完整流程、第一人称情感框架、拒绝的身体语言、空间示意和感谢信短句。已核对brief与rubric。</w:t>
       </w:r>
     </w:p>
     <w:p>
@@ -104,7 +104,7 @@
         <w:pStyle w:val="Subtitle"/>
       </w:pPr>
       <w:r>
-        <w:t>Suggested duration / 建议用时: 26 seconds</w:t>
+        <w:t>Suggested duration / 建议用时: 20 seconds</w:t>
       </w:r>
     </w:p>
     <w:p>
@@ -117,7 +117,7 @@
     </w:p>
     <w:p>
       <w:r>
-        <w:t>Little Rascal is a virtual pet game made with p5.js. You meet a small creature, care for it, and eventually say goodbye. I wanted a changing relationship, with real consequences: the pet can die if it is neglected. That risk is intended to make care feel like a responsibility and a challenge.</w:t>
+        <w:t>Little Rascal is a virtual pet made with p5.js. My question is how small acts of care can create attachment. The relationship changes as the pet grows. Neglect can be fatal, giving care a sense of responsibility and challenge.</w:t>
       </w:r>
     </w:p>
     <w:p>
@@ -130,7 +130,7 @@
     </w:p>
     <w:p>
       <w:r>
-        <w:t>Little Rascal 是我用 p5.js 制作的虚拟宠物游戏。你会认识一只小球，照顾它，最后和它告别。我希望这段关系会变化，照顾也有真实的后果：疏于照顾，宠物可能会死。这种风险是我有意加入的，希望玩家感到责任，也感到挑战。</w:t>
+        <w:t>Little Rascal 是我用 p5.js 制作的虚拟宠物。我想探索：日常的小小照顾怎样建立依恋。宠物成长时，这段关系也会变化。疏于照顾可能致死，让照顾带来责任感和挑战。</w:t>
       </w:r>
     </w:p>
     <w:p>
@@ -151,7 +151,7 @@
         <w:pStyle w:val="Subtitle"/>
       </w:pPr>
       <w:r>
-        <w:t>Suggested duration / 建议用时: 33 seconds</w:t>
+        <w:t>Suggested duration / 建议用时: 32 seconds</w:t>
       </w:r>
     </w:p>
     <w:p>
@@ -164,7 +164,7 @@
     </w:p>
     <w:p>
       <w:r>
-        <w:t>For an exhibition, I would present it on a computer with a mouse and headphones. That is the proposed setup, not a documented exhibition. The egg gently rocks before the first click. After the arrival animation, the player gives the pet a name. A short guide introduces care. The moving egg invites a first action, but the toy is less obvious: someone could still mistake it for decoration.</w:t>
+        <w:t>For an exhibition, I would use a computer, mouse and headphones. A rocking egg invites the first click. A shooting star introduces the pet, then the player gives it a name and sees a short guide. The loop is simple: meet, care, grow, say goodbye, then meet a new egg. The toy is less obvious than the egg; a first-time player could still mistake it for decoration.</w:t>
       </w:r>
     </w:p>
     <w:p>
@@ -177,7 +177,7 @@
     </w:p>
     <w:p>
       <w:r>
-        <w:t>如果放在展览里，我会用一台配鼠标和耳机的电脑展示。这是预想的展览设置，不是已经记录过的展览现场。第一次点击之前，蛋会轻轻晃动。出场动画后，玩家给小球起名，再通过简短说明了解照顾方式。晃动的蛋能暗示第一次操作，但玩具球还不够明确：第一次玩的观众可能会以为它只是装饰。</w:t>
+        <w:t>如果用于展览，我会选择电脑、鼠标和耳机。轻轻晃动的蛋邀请第一次点击，流星带来小球，之后玩家起名并阅读简短说明。流程很简单：相遇、照顾、成长、告别，再遇见新的蛋。玩具的操作暗示没有蛋那么明显；第一次玩的观众仍可能以为它只是装饰。</w:t>
       </w:r>
     </w:p>
     <w:p>
@@ -310,7 +310,7 @@
     </w:p>
     <w:p>
       <w:r>
-        <w:t>理论：Norman (2004)。本页是基于理论的设计解释，不是测得的玩家情感结果。</w:t>
+        <w:t>理论：Norman (2004)。本页是基于理论的设计解释，不是测得的玩家情感结果。 融入版本1的第一人称视角句作为“期望的玩家体验”，不是实际受访者引语。</w:t>
       </w:r>
     </w:p>
     <w:p>
@@ -331,7 +331,7 @@
         <w:pStyle w:val="Subtitle"/>
       </w:pPr>
       <w:r>
-        <w:t>Suggested duration / 建议用时: 38 seconds</w:t>
+        <w:t>Suggested duration / 建议用时: 33 seconds</w:t>
       </w:r>
     </w:p>
     <w:p>
@@ -344,7 +344,7 @@
     </w:p>
     <w:p>
       <w:r>
-        <w:t>I shortened the life cycle from four stages to three to address the time needed for a complete experience. Teenager and adult overlapped, so I combined them into Youth and kept the refusal behaviour there. Childhood now needs three useful feeds and three accepted pettings, then sleep and waking. Youth keeps two useful feeds and two other care actions before waking into old age. The shorter sequence keeps childhood, independence and aging, with one fewer transition to wait through.</w:t>
+        <w:t>I shortened four stages to three to reduce the time needed for a complete visit. Teenager and adult overlapped, so I combined them into Youth and kept its refusal behaviour. Useful care followed by sleep leads to growth. The shortened sequence still moves from dependence to independence, then a stronger need for companionship. Childhood needs three useful feeds and three accepted pettings; the next waking completes that transition.</w:t>
       </w:r>
     </w:p>
     <w:p>
@@ -357,7 +357,7 @@
     </w:p>
     <w:p>
       <w:r>
-        <w:t>为了缩短一次完整体验需要的时间，我已经把四个阶段缩减成了三个。teenager 和 adult 的定位重叠，所以我把它们合并成青年，并把拒绝行为保留在那里。现在幼年需要三次有效喂食、三次接受的摸摸，再睡醒。青年保留两次有效喂食和两次其他照顾，再睡醒进入老年。缩短后的流程仍保留了幼年、独立和衰老，也减少了一次需要等待的过渡。</w:t>
+        <w:t>为了缩短完整体验的时间，我把四阶段减成三阶段。teenager 与 adult 定位重叠，所以我合并成青年，并保留拒绝行为。有效照顾之后，通过睡眠和醒来成长。缩短后的流程仍保留从依赖到独立，再到更需要陪伴的变化。幼年需要三次有效喂食、三次接受的摸摸，再在下一次醒来完成成长。</w:t>
       </w:r>
     </w:p>
     <w:p>
@@ -451,7 +451,7 @@
         <w:pStyle w:val="Subtitle"/>
       </w:pPr>
       <w:r>
-        <w:t>Suggested duration / 建议用时: 38 seconds</w:t>
+        <w:t>Suggested duration / 建议用时: 37 seconds</w:t>
       </w:r>
     </w:p>
     <w:p>
@@ -464,7 +464,7 @@
     </w:p>
     <w:p>
       <w:r>
-        <w:t>Youth can refuse feeding, petting or play, with a baseline chance of twenty-five percent. Repeated requests or a full need can produce a still, unimpressed response instead. I wanted it to feel less like a machine that always obeys. However, refusal can also look like a broken control. I revised reactions that lasted too long and kept comfort available when mood is critical. The remaining question is whether a new player reads the refusal as personality or as failure.</w:t>
+        <w:t>Youth has a twenty-five percent baseline chance to refuse feeding, petting or play. Angry petting refusal can include an escape hop; refused play can send the ball away. Repetition or a full need can instead produce a still, unimpressed face. These different movements help explain the response. Yet refusal can look like a broken control. I shortened reactions that persisted and kept petting available at critical mood. The challenge is making independence readable without making care feel unresponsive.</w:t>
       </w:r>
     </w:p>
     <w:p>
@@ -477,7 +477,7 @@
     </w:p>
     <w:p>
       <w:r>
-        <w:t>青年对喂食、摸摸和玩耍有百分之二十五的基础拒绝概率。重复请求，或者对应数值已满时，也可能让它停在原地，露出无语脸。我不想让它像一台永远服从的机器。不过，拒绝也可能被误认为按钮坏了。我修正了持续过久的反应，并保留心情极低时能被安抚的摸摸。还需要验证的是，新玩家会把拒绝理解为性格，还是操作失败。</w:t>
+        <w:t>青年对喂食、摸摸和玩耍有百分之二十五的基础拒绝概率。生气地拒绝摸摸时，它可能跳开；拒绝玩球时，会把球踢走。重复操作或对应数值已满，则可能出现原地不动的无语脸。不同动作帮助玩家理解回应。但拒绝也可能像按钮坏了。我修正了持续过久的反应，并保留心情极低时能进行的摸摸。挑战在于让独立性看得懂，同时不让照顾显得没有反应。</w:t>
       </w:r>
     </w:p>
     <w:p>
@@ -623,7 +623,67 @@
         <w:pStyle w:val="Heading1"/>
       </w:pPr>
       <w:r>
-        <w:t>10  Farewell becomes a new beginning</w:t>
+        <w:t>10  2D rules make each response feel physical</w:t>
+      </w:r>
+    </w:p>
+    <w:p>
+      <w:pPr>
+        <w:pStyle w:val="Subtitle"/>
+      </w:pPr>
+      <w:r>
+        <w:t>Suggested duration / 建议用时: 32 seconds</w:t>
+      </w:r>
+    </w:p>
+    <w:p>
+      <w:pPr>
+        <w:pStyle w:val="Heading2"/>
+      </w:pPr>
+      <w:r>
+        <w:t>English — spoken</w:t>
+      </w:r>
+    </w:p>
+    <w:p>
+      <w:r>
+        <w:t>The game is drawn in two dimensions. Floor position and jump height are separate, so the shadow stays on the floor while the pet hops. Objects are drawn in depth order. The same separation helps a kick happen at contact, not at a distance. Care, expressions and sound then respond to the current state. These rules support readable behaviour, rather than just adding visual polish.</w:t>
+      </w:r>
+    </w:p>
+    <w:p>
+      <w:pPr>
+        <w:pStyle w:val="Heading2"/>
+      </w:pPr>
+      <w:r>
+        <w:t>中文对照 — 不另读</w:t>
+      </w:r>
+    </w:p>
+    <w:p>
+      <w:r>
+        <w:t>游戏是用二维画面绘制的。地面位置和跳跃高度分开计算，所以小球跳起时，影子仍留在地面。物体按前后顺序绘制。这样的分离也帮助踢球发生在实际接触时，而不是隔空发生。照顾、表情和声音再根据当前状态作出回应。这些规则是为了让行为可读，而不只是增加画面效果。</w:t>
+      </w:r>
+    </w:p>
+    <w:p>
+      <w:pPr>
+        <w:pStyle w:val="Heading2"/>
+      </w:pPr>
+      <w:r>
+        <w:t>Recording cue / 核实与操作提示</w:t>
+      </w:r>
+    </w:p>
+    <w:p>
+      <w:r>
+        <w:t>来自版本1的空间示意优点，改为解释系统怎样支持交互反馈。画布内部仍为900×640，CSS只缩放显示。示意图是概念图，不是独立观众测试证据。不把实现文件名作为口播重点。</w:t>
+      </w:r>
+    </w:p>
+    <w:p>
+      <w:r>
+        <w:br w:type="page"/>
+      </w:r>
+    </w:p>
+    <w:p>
+      <w:pPr>
+        <w:pStyle w:val="Heading1"/>
+      </w:pPr>
+      <w:r>
+        <w:t>11  Farewell becomes a new beginning</w:t>
       </w:r>
     </w:p>
     <w:p>
@@ -683,7 +743,7 @@
         <w:pStyle w:val="Heading1"/>
       </w:pPr>
       <w:r>
-        <w:t>11  What the feedback actually tells me</w:t>
+        <w:t>12  What the feedback actually tells me</w:t>
       </w:r>
     </w:p>
     <w:p>
@@ -691,7 +751,7 @@
         <w:pStyle w:val="Subtitle"/>
       </w:pPr>
       <w:r>
-        <w:t>Suggested duration / 建议用时: 40 seconds</w:t>
+        <w:t>Suggested duration / 建议用时: 26 seconds</w:t>
       </w:r>
     </w:p>
     <w:p>
@@ -704,7 +764,7 @@
     </w:p>
     <w:p>
       <w:r>
-        <w:t>Peer suggestions helped me move beyond a cute character on screen: background music, a toy that feels more interactive, and clearer expressions. My own playthroughs then exposed more specific problems, including disconnected pursuit, slow-motion aging and a rushed hatch. I revised those details, while tutor advice focused my attention on sound and readable needs. These are useful development observations, not a controlled audience study. I can explain what changed, but I cannot yet claim that the final version creates attachment for every player.</w:t>
+        <w:t>Peer feedback prompted background music, richer expressions and more interactive toy play. My playthroughs exposed disconnected pursuit, slow-motion aging and a rushed hatch. Tutor advice focused on sound and readable needs. Each led to a visible revision. This qualitative feedback explains my decisions, but it does not establish how every visitor will feel.</w:t>
       </w:r>
     </w:p>
     <w:p>
@@ -717,7 +777,7 @@
     </w:p>
     <w:p>
       <w:r>
-        <w:t>同学的建议推动我把作品从屏幕上的可爱角色往前推进：加入背景音乐、让玩具更有互动性、让表情更清楚。自己的反复试玩又暴露出更具体的问题，包括隔空追球、像慢放一样的衰老，以及太快的孵化过程。我修改了这些细节；老师的建议则让我更关注声音和状态是否可读。这些是有用的开发观察，不是受控的受众研究。我能说明改了什么，但还不能声称最终版本会让所有玩家产生依恋。</w:t>
+        <w:t>同学建议促成了背景音乐、更丰富的表情和更有互动性的玩具。自己的试玩发现了隔空追球、慢放式衰老和太快的出场；老师的意见集中在声音与状态可读性。这些建议都对应了看得见的修改。这些定性反馈能够解释我的决定，但不能证明每位观众都会产生什么情绪。</w:t>
       </w:r>
     </w:p>
     <w:p>
@@ -743,7 +803,7 @@
         <w:pStyle w:val="Heading1"/>
       </w:pPr>
       <w:r>
-        <w:t>12  Consequences are part of caring</w:t>
+        <w:t>13  Consequences are part of caring</w:t>
       </w:r>
     </w:p>
     <w:p>
@@ -803,7 +863,7 @@
         <w:pStyle w:val="Heading1"/>
       </w:pPr>
       <w:r>
-        <w:t>13  What I would test next</w:t>
+        <w:t>14  What I would test next</w:t>
       </w:r>
     </w:p>
     <w:p>
@@ -811,7 +871,7 @@
         <w:pStyle w:val="Subtitle"/>
       </w:pPr>
       <w:r>
-        <w:t>Suggested duration / 建议用时: 37 seconds</w:t>
+        <w:t>Suggested duration / 建议用时: 28 seconds</w:t>
       </w:r>
     </w:p>
     <w:p>
@@ -824,7 +884,7 @@
     </w:p>
     <w:p>
       <w:r>
-        <w:t>The four-to-three-stage change already shortens the visit. Next, I would check whether that revised length works for first-time players, rather than assume it does. Without coaching, do they discover dragging, understand a refusal and respond to warnings? I would compare clearer cues and slightly longer warning periods while keeping the possibility of death. Saved progress and separate voice controls remain future possibilities. The next version should build on the shorter cycle, not add stages back in.</w:t>
+        <w:t>The three-stage revision already shortens the visit. I would next watch first-time players without coaching: do they discover dragging, understand refusal and act on warnings? I would compare clearer cues and slightly longer warning periods while keeping the risk of death. I would also check the revised duration. Saved progress and separate voice controls are future possibilities.</w:t>
       </w:r>
     </w:p>
     <w:p>
@@ -837,7 +897,7 @@
     </w:p>
     <w:p>
       <w:r>
-        <w:t>从四阶段缩成三阶段，已经缩短了体验。下一步，我会验证这个调整后的长度是否适合第一次玩的玩家，而不是直接假定它已经合适。在没有指导时，他们会发现拖拽、理解拒绝并回应警告吗？我会比较更清楚的提示和稍长的警告期，同时保留死亡的可能性。存档与独立叫声控制仍是未来方向。下一版应该在缩短后的流程上完善，而不是再加回阶段。</w:t>
+        <w:t>三阶段的修改已经缩短了体验。下一步，我会在不指导的情况下观察新玩家：他们能发现拖拽、理解拒绝、回应警告吗？我会保留死亡风险，比较更清楚的提示和稍长的警告时间，也验证缩短后的体验长度。存档和独立叫声控制是未来方向。</w:t>
       </w:r>
     </w:p>
     <w:p>
@@ -863,7 +923,7 @@
         <w:pStyle w:val="Heading1"/>
       </w:pPr>
       <w:r>
-        <w:t>14  A little life, then another beginning</w:t>
+        <w:t>15  A little life, then another beginning</w:t>
       </w:r>
     </w:p>
     <w:p>
@@ -923,7 +983,7 @@
         <w:pStyle w:val="Heading1"/>
       </w:pPr>
       <w:r>
-        <w:t>15  References &amp; source notes</w:t>
+        <w:t>16  References &amp; source notes</w:t>
       </w:r>
     </w:p>
     <w:p>
@@ -941,7 +1001,7 @@
     </w:p>
     <w:p>
       <w:r>
-        <w:t>15</w:t>
+        <w:t>16</w:t>
       </w:r>
     </w:p>
     <w:p>
@@ -1034,7 +1094,7 @@
         <w:pStyle w:val="Heading1"/>
       </w:pPr>
       <w:r>
-        <w:t>16  AI assistance &amp; submission record</w:t>
+        <w:t>17  AI assistance &amp; submission record</w:t>
       </w:r>
     </w:p>
     <w:p>
@@ -1052,7 +1112,7 @@
     </w:p>
     <w:p>
       <w:r>
-        <w:t>16</w:t>
+        <w:t>17</w:t>
       </w:r>
     </w:p>
     <w:p>
@@ -1136,7 +1196,7 @@
     </w:p>
     <w:p>
       <w:r>
-        <w:t>Slides 3–7, 9–10: real input/response, growth conditions, resistance, visible needs and player-controlled farewell.</w:t>
+        <w:t>Slides 3–7, 9–11: real input/response, growth conditions, resistance, visible needs and player-controlled farewell.</w:t>
       </w:r>
     </w:p>
     <w:p>
@@ -1149,7 +1209,7 @@
     </w:p>
     <w:p>
       <w:r>
-        <w:t>Slides 4, 6, 8–10: Norman, physical contact, hop/rest rhythm, bodily hunger and a clickable envelope.</w:t>
+        <w:t>Slides 4, 6, 8–11: Norman, physical contact, hop/rest rhythm, bodily hunger and a clickable envelope.</w:t>
       </w:r>
     </w:p>
     <w:p>
@@ -1162,7 +1222,7 @@
     </w:p>
     <w:p>
       <w:r>
-        <w:t>Slides 5–11, 15–16: own iteration comparisons, tutor suggestions, sources and AI disclosure. Includes designer-reported peer suggestions; the designer’s feedback given to another student still needs documentation.</w:t>
+        <w:t>Slides 5–12, 16–17: own iteration comparisons, tutor suggestions, sources and AI disclosure. Includes designer-reported peer suggestions; the designer’s feedback given to another student still needs documentation.</w:t>
       </w:r>
     </w:p>
     <w:p>
@@ -1175,7 +1235,7 @@
     </w:p>
     <w:p>
       <w:r>
-        <w:t>Slides 7, 11–14: misunderstanding risk, evidence limits, punitive timing, exhibition dwell time and a concrete future test plan.</w:t>
+        <w:t>Slides 7, 12–15: misunderstanding risk, evidence limits, punitive timing, exhibition dwell time and a concrete future test plan.</w:t>
       </w:r>
     </w:p>
     <w:p>

</xml_diff>

<commit_message>
Rewrite narration around stated design intentions and correct combined childhood care rule
</commit_message>
<xml_diff>
--- a/presentation/Little_Rascal_Speaker_Script_EN_ZH.docx
+++ b/presentation/Little_Rascal_Speaker_Script_EN_ZH.docx
@@ -15,12 +15,17 @@
         <w:pStyle w:val="Heading1"/>
       </w:pPr>
       <w:r>
-        <w:t>Reflection script / 反思演讲稿</w:t>
+        <w:t>演讲稿 · 重写版 / Presentation script</w:t>
       </w:r>
     </w:p>
     <w:p>
       <w:r>
-        <w:t>17 slides: 15 main slides + 2 reference/disclosure appendices. English narration: 1022 words, including the demo narration. Planned total: 9:43, including a 2-minute edited demonstration. Chinese is for rehearsal only.</w:t>
+        <w:t>14 main slides + 3 supporting appendices. English: 954 words. Planned total: 9:25, including a 120-second edited demonstration. Rehearse to keep the final video within 8–10 minutes.</w:t>
+      </w:r>
+    </w:p>
+    <w:p>
+      <w:r>
+        <w:t>中文用于理解和排练，不用把两种语言各读一遍。正文讲设计初衷、实际玩法和修改原因；规则参数、来源核对和技术示意放在备注与附录。</w:t>
       </w:r>
     </w:p>
     <w:p>
@@ -28,7 +33,7 @@
         <w:pStyle w:val="Heading2"/>
       </w:pPr>
       <w:r>
-        <w:t>融合版本1与版本2的修改重点</w:t>
+        <w:t>已明确的设计初衷</w:t>
       </w:r>
     </w:p>
     <w:p>
@@ -36,7 +41,7 @@
         <w:pStyle w:val="ListBullet"/>
       </w:pPr>
       <w:r>
-        <w:t>以你上传的（2）为实际底稿，保留其迭代与反思主线；吸收（1）的情感设问、完整流程、第一人称情感框架、拒绝的身体语言、空间示意和感谢信短句。已核对brief与rubric。</w:t>
+        <w:t>起名：让玩家觉得“这是我的小球”，建立情感连接和照顾它的责任感。</w:t>
       </w:r>
     </w:p>
     <w:p>
@@ -44,7 +49,7 @@
         <w:pStyle w:val="ListBullet"/>
       </w:pPr>
       <w:r>
-        <w:t>老师多次明确总视频为8–10分钟；第3页另写演示约2分钟、反思约8分钟。因此以总长不超过10分钟为准，约2分钟演示＋7分36秒讲解，按实际语速排练。</w:t>
+        <w:t>死亡：增加责任感和挑战性。照顾不周会有后果；自然老死有不同的告别。</w:t>
       </w:r>
     </w:p>
     <w:p>
@@ -52,7 +57,7 @@
         <w:pStyle w:val="ListBullet"/>
       </w:pPr>
       <w:r>
-        <w:t>从功能介绍改为设计反思：展览发现过程、前后对比、修改原因、代价和下一步验证。</w:t>
+        <w:t>老年：行动变慢，同时更依恋玩家，会主动请求摸摸。</w:t>
       </w:r>
     </w:p>
     <w:p>
@@ -60,7 +65,7 @@
         <w:pStyle w:val="ListBullet"/>
       </w:pPr>
       <w:r>
-        <w:t>第一人称内容依据你的实际修改要求整理；个人分析只是编辑草稿，请逐句核实并用自己的话表达，不应让AI代替自己的反思。</w:t>
+        <w:t>时长：已经由四阶段缩成三阶段，缩短完整体验。</w:t>
       </w:r>
     </w:p>
     <w:p>
@@ -68,22 +73,7 @@
         <w:pStyle w:val="ListBullet"/>
       </w:pPr>
       <w:r>
-        <w:t>依据你补充的真实同学建议、老师意见及本人试玩整理；不编造人数、逐字引语、展览经历或观众情绪。</w:t>
-      </w:r>
-    </w:p>
-    <w:p>
-      <w:pPr>
-        <w:pStyle w:val="ListBullet"/>
-      </w:pPr>
-      <w:r>
-        <w:t>这次只更新展示材料，没有改变游戏代码、玩法、数值或美术。</w:t>
-      </w:r>
-    </w:p>
-    <w:p>
-      <w:r>
-        <w:t>Current game: https://itsangelia.github.io/little-rascal/?v=d3ab74f</w:t>
-        <w:br/>
-        <w:t>Source files: https://github.com/itsangelia/little-rascal</w:t>
+        <w:t>生命循环：从蛋到成长、衰老和死亡，再由星光汇成新蛋。</w:t>
       </w:r>
     </w:p>
     <w:p>
@@ -104,7 +94,7 @@
         <w:pStyle w:val="Subtitle"/>
       </w:pPr>
       <w:r>
-        <w:t>Suggested duration / 建议用时: 20 seconds</w:t>
+        <w:t>建议用时 / Suggested time: 25 seconds</w:t>
       </w:r>
     </w:p>
     <w:p>
@@ -117,7 +107,7 @@
     </w:p>
     <w:p>
       <w:r>
-        <w:t>Little Rascal is a virtual pet made with p5.js. My question is how small acts of care can create attachment. The relationship changes as the pet grows. Neglect can be fatal, giving care a sense of responsibility and challenge.</w:t>
+        <w:t>Hello, this is Little Rascal, a p5.js virtual pet game. Players name a pet and care for it through childhood, youth and old age. I want them to feel connected to their pet and responsible for its life. The game follows a cycle from one egg to the next.</w:t>
       </w:r>
     </w:p>
     <w:p>
@@ -125,12 +115,12 @@
         <w:pStyle w:val="Heading2"/>
       </w:pPr>
       <w:r>
-        <w:t>中文对照 — 不另读</w:t>
+        <w:t>中文对照</w:t>
       </w:r>
     </w:p>
     <w:p>
       <w:r>
-        <w:t>Little Rascal 是我用 p5.js 制作的虚拟宠物。我想探索：日常的小小照顾怎样建立依恋。宠物成长时，这段关系也会变化。疏于照顾可能致死，让照顾带来责任感和挑战。</w:t>
+        <w:t>大家好，这是 Little Rascal，一个用 p5.js 制作的虚拟宠物游戏。玩家起名，照顾小球经历幼年、青年和老年。我希望他们和自己的小球建立情感连接，对它的生命产生责任感。游戏从一颗蛋开始，循环到下一颗蛋。</w:t>
       </w:r>
     </w:p>
     <w:p>
@@ -143,7 +133,7 @@
         <w:pStyle w:val="Heading1"/>
       </w:pPr>
       <w:r>
-        <w:t>02  What does a visitor notice first?</w:t>
+        <w:t>02  Giving it a name</w:t>
       </w:r>
     </w:p>
     <w:p>
@@ -151,7 +141,7 @@
         <w:pStyle w:val="Subtitle"/>
       </w:pPr>
       <w:r>
-        <w:t>Suggested duration / 建议用时: 32 seconds</w:t>
+        <w:t>建议用时 / Suggested time: 32 seconds</w:t>
       </w:r>
     </w:p>
     <w:p>
@@ -164,7 +154,7 @@
     </w:p>
     <w:p>
       <w:r>
-        <w:t>For an exhibition, I would use a computer, mouse and headphones. A rocking egg invites the first click. A shooting star introduces the pet, then the player gives it a name and sees a short guide. The loop is simple: meet, care, grow, say goodbye, then meet a new egg. The toy is less obvious than the egg; a first-time player could still mistake it for decoration.</w:t>
+        <w:t>A gently rocking egg invites the first click. A shooting star crosses the room, and the pet appears. Then the player names it. Naming makes the player feel, “This is my pet.” It starts the emotional connection and the responsibility to look after it. The original arrival was too quick, so I extended it to give players time to see the pet before naming it.</w:t>
       </w:r>
     </w:p>
     <w:p>
@@ -172,12 +162,12 @@
         <w:pStyle w:val="Heading2"/>
       </w:pPr>
       <w:r>
-        <w:t>中文对照 — 不另读</w:t>
+        <w:t>中文对照</w:t>
       </w:r>
     </w:p>
     <w:p>
       <w:r>
-        <w:t>如果用于展览，我会选择电脑、鼠标和耳机。轻轻晃动的蛋邀请第一次点击，流星带来小球，之后玩家起名并阅读简短说明。流程很简单：相遇、照顾、成长、告别，再遇见新的蛋。玩具的操作暗示没有蛋那么明显；第一次玩的观众仍可能以为它只是装饰。</w:t>
+        <w:t>蛋轻轻晃动，暗示玩家点击。流星划过房间，小球出现，然后玩家起名。起名是为了让玩家觉得“这是我的小球”，开始建立情感连接和照顾它的责任感。原来的出场太快，所以我延长了动画，让玩家起名前有时间看清小球。</w:t>
       </w:r>
     </w:p>
     <w:p>
@@ -185,12 +175,12 @@
         <w:pStyle w:val="Heading2"/>
       </w:pPr>
       <w:r>
-        <w:t>Recording cue / 核实与操作提示</w:t>
+        <w:t>备注 — 不读 / Notes</w:t>
       </w:r>
     </w:p>
     <w:p>
       <w:r>
-        <w:t>展示形式为拟定方案。当前没有展览现场照片或观众记录。录屏须保留实际点击、拖拽与角色反应。</w:t>
+        <w:t>拟定展览形式：电脑、鼠标及耳机。此处不声称已经举办展览。演示保留点击蛋、流星、角色出现和实际输入名字。</w:t>
       </w:r>
     </w:p>
     <w:p>
@@ -203,7 +193,7 @@
         <w:pStyle w:val="Heading1"/>
       </w:pPr>
       <w:r>
-        <w:t>03  Two minutes inside the room</w:t>
+        <w:t>03  How the game works</w:t>
       </w:r>
     </w:p>
     <w:p>
@@ -211,7 +201,7 @@
         <w:pStyle w:val="Subtitle"/>
       </w:pPr>
       <w:r>
-        <w:t>Suggested duration / 建议用时: 120 seconds</w:t>
+        <w:t>建议用时 / Suggested time: 120 seconds</w:t>
       </w:r>
     </w:p>
     <w:p>
@@ -224,7 +214,7 @@
     </w:p>
     <w:p>
       <w:r>
-        <w:t>First, I click the egg and give the pet a name. Here, I can feed it, pet it, or throw the toy. Notice that the kick happens when they meet. I have cut between life stages to show the full sequence. In old age, it pauses to rest and asks for affection. After the farewell, the player chooses when to open the letter.</w:t>
+        <w:t>Here is a short recording of the game. The player can feed the pet, stroke it, throw its toy, clean the room and let it sleep. I have cut between stages to show the full life cycle. Watch how its reactions change as it grows. At the end, the player opens the letter, and a new egg appears.</w:t>
       </w:r>
     </w:p>
     <w:p>
@@ -232,12 +222,12 @@
         <w:pStyle w:val="Heading2"/>
       </w:pPr>
       <w:r>
-        <w:t>中文对照 — 不另读</w:t>
+        <w:t>中文对照</w:t>
       </w:r>
     </w:p>
     <w:p>
       <w:r>
-        <w:t>首先，我点击蛋，给它起名。在这里，我可以喂食、摸摸，或者扔出玩具。注意，踢球是在它们碰到时发生的。我剪接了不同成长阶段，方便展示完整流程。到了老年，它会停下来休息，也会表达想被摸摸的需要。告别后，由玩家决定什么时候打开信。</w:t>
+        <w:t>接下来是一段简短的游戏录屏。玩家可以喂食、摸摸、扔玩具、清理房间和让小球睡觉。我剪接了不同阶段，展示完整的生命周期。可以留意小球成长后回应的变化。最后，玩家打开信，新的蛋出现。</w:t>
       </w:r>
     </w:p>
     <w:p>
@@ -245,12 +235,12 @@
         <w:pStyle w:val="Heading2"/>
       </w:pPr>
       <w:r>
-        <w:t>Recording cue / 核实与操作提示</w:t>
+        <w:t>备注 — 不读 / Notes</w:t>
       </w:r>
     </w:p>
     <w:p>
       <w:r>
-        <w:t>本页预留120秒实际录屏，尚未嵌入视频。英文口播包含在这120秒内，不另加时。00:00–00:25 点击蛋/流星/起名；00:25–00:55 喂食/摸摸/拖球并踢中；00:55–01:20 青年拒绝与状态变化；01:20–02:00 老年休息/气泡/消散/点击信封/新蛋。明确标注“Edited walkthrough · cuts between life stages”。可以剪接你自己录制的画面，不能当作观众测试录像。</w:t>
+        <w:t>本页预留120秒实际录屏；这段口播包含在120秒内。00:00–00:25 蛋/流星/起名；00:25–00:55 喂食/摸摸/拖球与接触后踢球；00:55–01:20 青年表情与拒绝；01:20–02:00 老年休息/要摸摸/自然告别/点信封/新蛋。阶段间清楚剪接，不能称为两分钟连续养完整一生。视频尚未嵌入。</w:t>
       </w:r>
     </w:p>
     <w:p>
@@ -263,7 +253,7 @@
         <w:pStyle w:val="Heading1"/>
       </w:pPr>
       <w:r>
-        <w:t>04  Why care might become attachment</w:t>
+        <w:t>04  What I wanted the player to feel</w:t>
       </w:r>
     </w:p>
     <w:p>
@@ -271,7 +261,7 @@
         <w:pStyle w:val="Subtitle"/>
       </w:pPr>
       <w:r>
-        <w:t>Suggested duration / 建议用时: 37 seconds</w:t>
+        <w:t>建议用时 / Suggested time: 34 seconds</w:t>
       </w:r>
     </w:p>
     <w:p>
@@ -284,7 +274,7 @@
     </w:p>
     <w:p>
       <w:r>
-        <w:t>Norman’s framework helps me explain three parts of the experience. The watercolor room and simple face are the first, visceral invitation. At the behavioural level, care has a readable response: a smile, a refusal, or a kick. Reflection comes through the life cycle: birth, growth, aging, farewell and a new egg. The letter recalls one relationship; the next egg invites another. I am aiming for affection and gentle loss, without claiming those emotions have been measured.</w:t>
+        <w:t>Norman’s three levels help explain these choices. Visceral design is the first impression: the soft room and the pet’s appearance invite the player closer. Behavioural design is the response to feeding, touching and playing. Reflective design is the meaning of that care. Giving the pet a name makes it personal; watching it age and reading its final letter bring the player back to the life they have looked after.</w:t>
       </w:r>
     </w:p>
     <w:p>
@@ -292,12 +282,12 @@
         <w:pStyle w:val="Heading2"/>
       </w:pPr>
       <w:r>
-        <w:t>中文对照 — 不另读</w:t>
+        <w:t>中文对照</w:t>
       </w:r>
     </w:p>
     <w:p>
       <w:r>
-        <w:t>诺曼的框架帮助我解释体验的三个部分。水彩房间和简单的脸，构成第一眼的本能吸引。在行为层面，照顾会得到看得懂的回应：微笑、拒绝，或踢球。反思则来自生命循环：出生、成长、衰老、告别，再出现新蛋。感谢信回顾一段关系，新蛋邀请下一次相遇。我希望引起喜爱和温柔的失落，但不声称这些情感已经被测量。</w:t>
+        <w:t>诺曼的三个层次帮助解释这些选择。本能层面是第一印象：柔和的房间与小球外形吸引玩家接近。行为层面是喂食、摸摸和玩耍得到的回应。反思层面是照顾的意义：起名让它成为自己的小球；看到它变老、读到最后的信，让玩家回顾自己照顾过的这段生命。</w:t>
       </w:r>
     </w:p>
     <w:p>
@@ -305,12 +295,12 @@
         <w:pStyle w:val="Heading2"/>
       </w:pPr>
       <w:r>
-        <w:t>Recording cue / 核实与操作提示</w:t>
+        <w:t>备注 — 不读 / Notes</w:t>
       </w:r>
     </w:p>
     <w:p>
       <w:r>
-        <w:t>理论：Norman (2004)。本页是基于理论的设计解释，不是测得的玩家情感结果。 融入版本1的第一人称视角句作为“期望的玩家体验”，不是实际受访者引语。</w:t>
+        <w:t>理论引用：Norman (2004)。描述设计目标，不写成已经测得的玩家情感。</w:t>
       </w:r>
     </w:p>
     <w:p>
@@ -323,7 +313,7 @@
         <w:pStyle w:val="Heading1"/>
       </w:pPr>
       <w:r>
-        <w:t>05  Four stages became three: a shorter visit</w:t>
+        <w:t>05  Three stages, three different responses</w:t>
       </w:r>
     </w:p>
     <w:p>
@@ -331,7 +321,7 @@
         <w:pStyle w:val="Subtitle"/>
       </w:pPr>
       <w:r>
-        <w:t>Suggested duration / 建议用时: 33 seconds</w:t>
+        <w:t>建议用时 / Suggested time: 36 seconds</w:t>
       </w:r>
     </w:p>
     <w:p>
@@ -344,7 +334,7 @@
     </w:p>
     <w:p>
       <w:r>
-        <w:t>I shortened four stages to three to reduce the time needed for a complete visit. Teenager and adult overlapped, so I combined them into Youth and kept its refusal behaviour. Useful care followed by sleep leads to growth. The shortened sequence still moves from dependence to independence, then a stronger need for companionship. Childhood needs three useful feeds and three accepted pettings; the next waking completes that transition.</w:t>
+        <w:t>I reduced four stages to three to shorten the experience, combining the middle stages into Youth. The little one needs feeding, petting and rest. Youth becomes mischievous and sometimes refuses care. The senior slows down and becomes more attached to the player. Growth depends on care: the little one needs three useful feeding or petting interactions in total, then its next sleep. Looking after it lets the player take part in its growth.</w:t>
       </w:r>
     </w:p>
     <w:p>
@@ -352,12 +342,12 @@
         <w:pStyle w:val="Heading2"/>
       </w:pPr>
       <w:r>
-        <w:t>中文对照 — 不另读</w:t>
+        <w:t>中文对照</w:t>
       </w:r>
     </w:p>
     <w:p>
       <w:r>
-        <w:t>为了缩短完整体验的时间，我把四阶段减成三阶段。teenager 与 adult 定位重叠，所以我合并成青年，并保留拒绝行为。有效照顾之后，通过睡眠和醒来成长。缩短后的流程仍保留从依赖到独立，再到更需要陪伴的变化。幼年需要三次有效喂食、三次接受的摸摸，再在下一次醒来完成成长。</w:t>
+        <w:t>为了缩短体验，我把中间阶段合并成青年，从四阶段减为三阶段。幼年需要喂食、摸摸和休息；青年更调皮，有时拒绝照顾；老年行动变慢，更依恋玩家。成长和照顾有关：幼年把喂食和摸摸合起来累计三次有效互动，再睡醒才长大。玩家通过照顾参与它的成长。</w:t>
       </w:r>
     </w:p>
     <w:p>
@@ -365,12 +355,12 @@
         <w:pStyle w:val="Heading2"/>
       </w:pPr>
       <w:r>
-        <w:t>Recording cue / 核实与操作提示</w:t>
+        <w:t>备注 — 不读 / Notes</w:t>
       </w:r>
     </w:p>
     <w:p>
       <w:r>
-        <w:t>有效喂食需触发实际照顾计数；幼年玩球、清理不能代替摸摸。计数达标不会即时变形，必须在之后完成睡眠和醒来。青年内部代码键仍为adult。 缩减阶段是作者已经实施的时长优化，不应表述为尚未处理时长。完整流程受照顾速度、睡眠与玩家选择影响，没有统一固定总时长。</w:t>
+        <w:t>实际顺序child→adult→elder，界面显示Little One/Youth/Senior。青年仍为两次有效喂食＋两次其他照顾后睡醒。计数达标不会立即变形。四减三是已经实施的时长优化。 幼年是喂食或摸摸合计三次，不是各三次；任意组合均可。三次喂食、三次摸摸或混合组合皆已浏览器验证。</w:t>
       </w:r>
     </w:p>
     <w:p>
@@ -383,7 +373,7 @@
         <w:pStyle w:val="Heading1"/>
       </w:pPr>
       <w:r>
-        <w:t>06  Play needed a visible point of contact</w:t>
+        <w:t>06  Making the toy something to play with</w:t>
       </w:r>
     </w:p>
     <w:p>
@@ -391,7 +381,7 @@
         <w:pStyle w:val="Subtitle"/>
       </w:pPr>
       <w:r>
-        <w:t>Suggested duration / 建议用时: 38 seconds</w:t>
+        <w:t>建议用时 / Suggested time: 34 seconds</w:t>
       </w:r>
     </w:p>
     <w:p>
@@ -404,7 +394,7 @@
     </w:p>
     <w:p>
       <w:r>
-        <w:t>At first, playing was mainly a button. Putting a toy in the room gave the player something to pick up and throw. But my earlier chase looked strange: the pet seemed to follow the ball without touching it. I also found the running too fast. I asked for a slower approach and a small kick at contact. The important change was the sequence: throw, approach, touch, kick. The sound now happens on the kick, rather than when PLAY is selected.</w:t>
+        <w:t>Playing started as a button. I put a toy in the room so the player could pick it up and throw it. The early chase looked disconnected, and the pet moved too fast. I changed this to a slower approach and a small kick at contact. The toy moves when the pet touches it, with a short call on the kick. This makes the interaction easier to follow.</w:t>
       </w:r>
     </w:p>
     <w:p>
@@ -412,12 +402,12 @@
         <w:pStyle w:val="Heading2"/>
       </w:pPr>
       <w:r>
-        <w:t>中文对照 — 不另读</w:t>
+        <w:t>中文对照</w:t>
       </w:r>
     </w:p>
     <w:p>
       <w:r>
-        <w:t>一开始，玩耍主要依靠按钮。把玩具放进房间后，玩家有了可以拿起来、扔出去的东西。但是早期追球很奇怪：宠物像是在隔空跟着球，碰不到它。我还觉得追球太快，于是要求减慢接近速度，碰到时再轻轻踢出去。真正重要的变化是动作顺序：扔出、接近、接触、踢开。现在声音也发生在踢中时，而不是选中 PLAY 的瞬间。</w:t>
+        <w:t>最初，玩耍是一个按钮。我把玩具放进房间，让玩家可以拿起并扔出去。早期追球像是碰不到球，移动也太快。我改成慢一点接近，接触时轻轻踢出去。碰到时玩具才移动，踢中还有短叫声，让互动更容易看懂。</w:t>
       </w:r>
     </w:p>
     <w:p>
@@ -425,12 +415,12 @@
         <w:pStyle w:val="Heading2"/>
       </w:pPr>
       <w:r>
-        <w:t>Recording cue / 核实与操作提示</w:t>
+        <w:t>备注 — 不读 / Notes</w:t>
       </w:r>
     </w:p>
     <w:p>
       <w:r>
-        <w:t>“之前”文字依据本对话中的作者试玩反馈，不是伪造的旧版截图。右侧图片为当前游戏。正式录制建议保留鼠标、球和宠物同框。</w:t>
+        <w:t>前后对比来自作者在本对话的具体反馈。图片展示当前游戏，不伪造早期截图。保留玩家扔球、宠物接近和接触动作同框。</w:t>
       </w:r>
     </w:p>
     <w:p>
@@ -443,7 +433,7 @@
         <w:pStyle w:val="Heading1"/>
       </w:pPr>
       <w:r>
-        <w:t>07  Youth does not always say yes</w:t>
+        <w:t>07  Youth has a temper</w:t>
       </w:r>
     </w:p>
     <w:p>
@@ -451,7 +441,7 @@
         <w:pStyle w:val="Subtitle"/>
       </w:pPr>
       <w:r>
-        <w:t>Suggested duration / 建议用时: 37 seconds</w:t>
+        <w:t>建议用时 / Suggested time: 35 seconds</w:t>
       </w:r>
     </w:p>
     <w:p>
@@ -464,7 +454,7 @@
     </w:p>
     <w:p>
       <w:r>
-        <w:t>Youth has a twenty-five percent baseline chance to refuse feeding, petting or play. Angry petting refusal can include an escape hop; refused play can send the ball away. Repetition or a full need can instead produce a still, unimpressed face. These different movements help explain the response. Yet refusal can look like a broken control. I shortened reactions that persisted and kept petting available at critical mood. The challenge is making independence readable without making care feel unresponsive.</w:t>
+        <w:t>I made Youth more mischievous. It has a twenty-five percent baseline chance of refusing food, petting or play. It may jump away from a touch or angrily kick the toy away. Repetition or a full need can make it look unimpressed and stay still. I want the player to notice these reactions and adjust their care. Its face and movements show when it is happy, annoyed or unwilling to play.</w:t>
       </w:r>
     </w:p>
     <w:p>
@@ -472,12 +462,12 @@
         <w:pStyle w:val="Heading2"/>
       </w:pPr>
       <w:r>
-        <w:t>中文对照 — 不另读</w:t>
+        <w:t>中文对照</w:t>
       </w:r>
     </w:p>
     <w:p>
       <w:r>
-        <w:t>青年对喂食、摸摸和玩耍有百分之二十五的基础拒绝概率。生气地拒绝摸摸时，它可能跳开；拒绝玩球时，会把球踢走。重复操作或对应数值已满，则可能出现原地不动的无语脸。不同动作帮助玩家理解回应。但拒绝也可能像按钮坏了。我修正了持续过久的反应，并保留心情极低时能进行的摸摸。挑战在于让独立性看得懂，同时不让照顾显得没有反应。</w:t>
+        <w:t>我把青年设计得更调皮。它对喂食、摸摸和玩耍有百分之二十五的基础拒绝概率。它会躲开摸摸，或者生气地踢走玩具。重复操作或需求已满时，会无语、站着不动。我希望玩家留意这些反应，调整照顾方式。表情和动作表现它是高兴、厌烦，还是不想玩。</w:t>
       </w:r>
     </w:p>
     <w:p>
@@ -485,12 +475,12 @@
         <w:pStyle w:val="Heading2"/>
       </w:pPr>
       <w:r>
-        <w:t>Recording cue / 核实与操作提示</w:t>
+        <w:t>备注 — 不读 / Notes</w:t>
       </w:r>
     </w:p>
     <w:p>
       <w:r>
-        <w:t>基础随机概率不是所有情形的最终拒绝率：满值、重复与危急安抚存在优先级。无语扣3心情，愤怒扣5；不要说拒绝不会影响数值。</w:t>
+        <w:t>满值、重复操作及危急安抚有优先级，所以25%是基础随机概率。低心情时摸摸保留安抚通道。无语与愤怒各扣一次心情，不把拒绝描述为没有后果。</w:t>
       </w:r>
     </w:p>
     <w:p>
@@ -503,7 +493,7 @@
         <w:pStyle w:val="Heading1"/>
       </w:pPr>
       <w:r>
-        <w:t>08  Older, slower, and more attached</w:t>
+        <w:t>08  Older and more attached to the player</w:t>
       </w:r>
     </w:p>
     <w:p>
@@ -511,7 +501,7 @@
         <w:pStyle w:val="Subtitle"/>
       </w:pPr>
       <w:r>
-        <w:t>Suggested duration / 建议用时: 38 seconds</w:t>
+        <w:t>建议用时 / Suggested time: 35 seconds</w:t>
       </w:r>
     </w:p>
     <w:p>
@@ -524,7 +514,7 @@
     </w:p>
     <w:p>
       <w:r>
-        <w:t>Simply slowing the animation looked like playback at half speed. Grounded walking also lost its character. I kept its bounce: three small, slower hops, then about three seconds still. I removed self-initiated ball play, though it still responds to a thrown ball. More importantly, the older pet becomes more attached to the player. It actively asks to be petted through a bubble, three times across senior life. Where Youth sometimes pulls away, Senior asks the player to come closer.</w:t>
+        <w:t>The senior becomes slower and more attached to the player. It asks to be petted through a thought bubble. Youth sometimes refuses attention; the senior actively asks for it. Getting the movement right took several revisions. Slowing everything looked like slow motion, and walking did not suit it. I kept three small, slower hops followed by about three seconds of rest. It still looks like the same pet, but older.</w:t>
       </w:r>
     </w:p>
     <w:p>
@@ -532,12 +522,12 @@
         <w:pStyle w:val="Heading2"/>
       </w:pPr>
       <w:r>
-        <w:t>中文对照 — 不另读</w:t>
+        <w:t>中文对照</w:t>
       </w:r>
     </w:p>
     <w:p>
       <w:r>
-        <w:t>单纯放慢动画，看起来像把视频调成半速。改成贴地走路，也失去了小球的特点。我保留了弹跳：连续三次较小、较慢的跳跃，然后停住约三秒。我删掉了它自己主动玩球的行为，但玩家扔球时它仍然回应。更重要的是，老年的小球变得更依恋玩家。它会通过气泡主动请求摸摸，老年期间出现三次。青年有时会躲开，老年则主动希望玩家靠近。</w:t>
+        <w:t>老年行动变慢，也更依恋玩家，会通过气泡请求摸摸。青年有时拒绝关注，老年却主动要陪伴。动作改了几次：整体放慢像慢放，贴地走又不适合它。我保留连续三次缓慢的小跳，再休息约三秒。它还是原来的小球，只是变老了。</w:t>
       </w:r>
     </w:p>
     <w:p>
@@ -545,12 +535,12 @@
         <w:pStyle w:val="Heading2"/>
       </w:pPr>
       <w:r>
-        <w:t>Recording cue / 核实与操作提示</w:t>
+        <w:t>备注 — 不读 / Notes</w:t>
       </w:r>
     </w:p>
     <w:p>
       <w:r>
-        <w:t>气泡为漫画框、三个小圈、卡通小手与爱心；不是文字“想摸摸”。睡觉、弹窗、忙碌或危险状态会推迟出现，不能说固定每隔若干秒出现。 作者明确：主动请求摸摸表现老年更依恋玩家，不只是交互提示。属于角色行为设计，不等于观众依恋程度已测量。</w:t>
+        <w:t>老年主动要摸摸气泡在自然离世前出现三次，忙碌时会推迟。老年不主动发起玩球；仍可回应玩家扔球。</w:t>
       </w:r>
     </w:p>
     <w:p>
@@ -563,7 +553,7 @@
         <w:pStyle w:val="Heading1"/>
       </w:pPr>
       <w:r>
-        <w:t>09  A body can explain what a bar cannot</w:t>
+        <w:t>09  Showing how the pet feels</w:t>
       </w:r>
     </w:p>
     <w:p>
@@ -571,7 +561,7 @@
         <w:pStyle w:val="Subtitle"/>
       </w:pPr>
       <w:r>
-        <w:t>Suggested duration / 建议用时: 39 seconds</w:t>
+        <w:t>建议用时 / Suggested time: 38 seconds</w:t>
       </w:r>
     </w:p>
     <w:p>
@@ -584,7 +574,7 @@
     </w:p>
     <w:p>
       <w:r>
-        <w:t>My tutor suggested adding sound and making needs more visible, including through bubbles. Peer feedback also called for background music, more engaging toy play and richer expressions. I developed the flattened hungry pose below thirty: the bar shows how much is left, while the body shows how hunger feels. The senior bubble asks for affection; not every need has a bubble. I recorded the pet’s voice and selected calls for petting, anger, crying, kicking and idle humming. Crying plays once on entry.</w:t>
+        <w:t>My tutor suggested clearer visual feedback for needs and more sound. The hungry pose already helped: below thirty hunger, the pet becomes flattened and weak. The player can see that it needs food. I kept this and added recorded calls for petting, anger, crying, kicking and occasional humming. I recorded the voice myself. Crying plays once when it begins. Together, the face, body and voice give the player more ways to notice how the pet is feeling.</w:t>
       </w:r>
     </w:p>
     <w:p>
@@ -592,12 +582,12 @@
         <w:pStyle w:val="Heading2"/>
       </w:pPr>
       <w:r>
-        <w:t>中文对照 — 不另读</w:t>
+        <w:t>中文对照</w:t>
       </w:r>
     </w:p>
     <w:p>
       <w:r>
-        <w:t>老师建议补充声音，并让状态更直观，比如使用气泡。同学也提出了加入背景音乐、增强玩具互动和丰富表情的建议。我完善了饥饿低于三十时饿扁的状态：数值条显示还剩多少，身体表现饥饿的感觉。老年气泡表达的是想被摸摸，并不是每个需求都有气泡。我录制了小球的声音，选出用于摸摸、生气、哭泣、踢球和自然哼哼的片段。哭声只在进入哭泣时播放一次。</w:t>
+        <w:t>老师建议把状态表现得更直观，并补充声音。原有的饿扁形态已经有这个作用：饥饿数值低于三十，小球会变扁、没精神，玩家能看出它需要吃东西。我保留这个表现，并加入摸摸、生气、哭泣、踢球和自然哼哼的叫声。声音是我自己录制的；哭声只在开始哭泣时播放一次。表情、身体和声音一起帮助玩家留意它的状态。</w:t>
       </w:r>
     </w:p>
     <w:p>
@@ -605,12 +595,12 @@
         <w:pStyle w:val="Heading2"/>
       </w:pPr>
       <w:r>
-        <w:t>Recording cue / 核实与操作提示</w:t>
+        <w:t>备注 — 不读 / Notes</w:t>
       </w:r>
     </w:p>
     <w:p>
       <w:r>
-        <w:t>反馈依据：作者在本对话中回忆同学提出背景音乐、增强玩具互动、丰富表情及饿扁状态；老师建议增加音效及状态可视化。属于作者报告的定性反馈，没有参与人数、录音逐字引语或正式研究。作者确认叫声为本人录制。BGM来自Pixabay（按pixaboy理解），音乐按钮只控制BGM。</w:t>
+        <w:t>气泡目前用于老年请求摸摸，不把老师建议写成“所有需求已改为气泡”。音乐按钮只关闭背景音乐。</w:t>
       </w:r>
     </w:p>
     <w:p>
@@ -623,7 +613,7 @@
         <w:pStyle w:val="Heading1"/>
       </w:pPr>
       <w:r>
-        <w:t>10  2D rules make each response feel physical</w:t>
+        <w:t>10  Why the pet can die</w:t>
       </w:r>
     </w:p>
     <w:p>
@@ -631,7 +621,7 @@
         <w:pStyle w:val="Subtitle"/>
       </w:pPr>
       <w:r>
-        <w:t>Suggested duration / 建议用时: 32 seconds</w:t>
+        <w:t>建议用时 / Suggested time: 39 seconds</w:t>
       </w:r>
     </w:p>
     <w:p>
@@ -644,7 +634,7 @@
     </w:p>
     <w:p>
       <w:r>
-        <w:t>The game is drawn in two dimensions. Floor position and jump height are separate, so the shadow stays on the floor while the pet hops. Objects are drawn in depth order. The same separation helps a kick happen at contact, not at a distance. Care, expressions and sound then respond to the current state. These rules support readable behaviour, rather than just adding visual polish.</w:t>
+        <w:t>I added death to give the player a stronger sense of responsibility and challenge. Feeding, comfort and cleaning affect whether the pet survives. Leaving it hungry, unhappy or in a dirty room can have consequences, so the player needs to keep paying attention. Natural old age is different: even with good care, its life eventually ends. I kept these endings separate. Neglect leads to the death result screen; the natural ending leads to the farewell and thank-you letter.</w:t>
       </w:r>
     </w:p>
     <w:p>
@@ -652,12 +642,12 @@
         <w:pStyle w:val="Heading2"/>
       </w:pPr>
       <w:r>
-        <w:t>中文对照 — 不另读</w:t>
+        <w:t>中文对照</w:t>
       </w:r>
     </w:p>
     <w:p>
       <w:r>
-        <w:t>游戏是用二维画面绘制的。地面位置和跳跃高度分开计算，所以小球跳起时，影子仍留在地面。物体按前后顺序绘制。这样的分离也帮助踢球发生在实际接触时，而不是隔空发生。照顾、表情和声音再根据当前状态作出回应。这些规则是为了让行为可读，而不只是增加画面效果。</w:t>
+        <w:t>加入死亡，是为了增加玩家的责任感和挑战性。喂食、安抚和清理会影响小球能否活下来。让它挨饿、不开心，或不清理房间，都会有后果，所以玩家需要持续关注。自然老死则不同：即使照顾得好，生命也会结束。我保留了两种不同的结尾：照顾不周进入死亡结算，自然老死进入告别与感谢信。</w:t>
       </w:r>
     </w:p>
     <w:p>
@@ -665,12 +655,12 @@
         <w:pStyle w:val="Heading2"/>
       </w:pPr>
       <w:r>
-        <w:t>Recording cue / 核实与操作提示</w:t>
+        <w:t>备注 — 不读 / Notes</w:t>
       </w:r>
     </w:p>
     <w:p>
       <w:r>
-        <w:t>来自版本1的空间示意优点，改为解释系统怎样支持交互反馈。画布内部仍为900×640，CSS只缩放显示。示意图是概念图，不是独立观众测试证据。不把实现文件名作为口播重点。</w:t>
+        <w:t>实际规则只留在备注：饥饿或心情为0持续8秒；每个粑粑6秒发臭，产生13秒后可病死。老年通常累计80秒可见活跃时间后自然离世，可被忙碌/气泡推迟。口播不堆时间参数。</w:t>
       </w:r>
     </w:p>
     <w:p>
@@ -683,7 +673,7 @@
         <w:pStyle w:val="Heading1"/>
       </w:pPr>
       <w:r>
-        <w:t>11  Farewell becomes a new beginning</w:t>
+        <w:t>11  Goodbye, then a new egg</w:t>
       </w:r>
     </w:p>
     <w:p>
@@ -691,7 +681,7 @@
         <w:pStyle w:val="Subtitle"/>
       </w:pPr>
       <w:r>
-        <w:t>Suggested duration / 建议用时: 37 seconds</w:t>
+        <w:t>建议用时 / Suggested time: 36 seconds</w:t>
       </w:r>
     </w:p>
     <w:p>
@@ -704,7 +694,7 @@
     </w:p>
     <w:p>
       <w:r>
-        <w:t>For natural old age, I replaced the abrupt result screen with a slower farewell. The pet pauses, softens and dissolves; its soul rises into stars. A gently moving envelope waits for a click, so the player chooses when to read the letter. Closing it gathers starlight into a new egg. This completes the life cycle: one relationship ends and another can begin. Neglect deaths keep the earlier result screen and restart; they do not receive this thank-you letter.</w:t>
+        <w:t>In the natural ending, the pet stops, softens slightly and slowly disappears. Its soul rises into stars, leaving an envelope on the floor. I changed the automatic letter popup into a clickable envelope, so players choose when to read its thanks. After they close it, starlight gathers into a new egg. This completes the cycle of birth, growth, death and new life. Another pet is ready to be named and cared for.</w:t>
       </w:r>
     </w:p>
     <w:p>
@@ -712,12 +702,12 @@
         <w:pStyle w:val="Heading2"/>
       </w:pPr>
       <w:r>
-        <w:t>中文对照 — 不另读</w:t>
+        <w:t>中文对照</w:t>
       </w:r>
     </w:p>
     <w:p>
       <w:r>
-        <w:t>自然老死的部分，我把突然出现的结算画面改成了缓慢告别。小球停下、身体软下来并消散，灵魂升起化成星星。轻轻晃动的信封等待点击，让玩家决定什么时候读信。关闭信后，星光汇成新的蛋。生命循环由此完成：一段关系结束，另一段可以开始。疏于照顾导致的死亡仍保留原来的结算与重新开始，不会收到这封感谢信。</w:t>
+        <w:t>自然结尾中，小球停住，身体轻微软下来，慢慢消散。灵魂升起化为星星，地上留下信封。我把自动弹出的信改成点击信封再打开，让玩家自己决定什么时候读它的感谢。关闭后，星光汇成新蛋，完成出生、成长、死亡与新生的循环。新的小球等待起名和照顾。</w:t>
       </w:r>
     </w:p>
     <w:p>
@@ -725,12 +715,12 @@
         <w:pStyle w:val="Heading2"/>
       </w:pPr>
       <w:r>
-        <w:t>Recording cue / 核实与操作提示</w:t>
+        <w:t>备注 — 不读 / Notes</w:t>
       </w:r>
     </w:p>
     <w:p>
       <w:r>
-        <w:t>自然离世通常从进入老年起累计80秒可见活跃时间；忙碌、三次需求气泡等可延后。可剪辑但不可声称完整生命周期只有80秒。感谢信原文不改。</w:t>
+        <w:t>不声称新蛋保存上一世名字、存档或记忆。感谢信原文保持作者提供版本；不在信上增加死因。</w:t>
       </w:r>
     </w:p>
     <w:p>
@@ -743,7 +733,7 @@
         <w:pStyle w:val="Heading1"/>
       </w:pPr>
       <w:r>
-        <w:t>12  What the feedback actually tells me</w:t>
+        <w:t>12  What feedback changed</w:t>
       </w:r>
     </w:p>
     <w:p>
@@ -751,7 +741,7 @@
         <w:pStyle w:val="Subtitle"/>
       </w:pPr>
       <w:r>
-        <w:t>Suggested duration / 建议用时: 26 seconds</w:t>
+        <w:t>建议用时 / Suggested time: 32 seconds</w:t>
       </w:r>
     </w:p>
     <w:p>
@@ -764,7 +754,7 @@
     </w:p>
     <w:p>
       <w:r>
-        <w:t>Peer feedback prompted background music, richer expressions and more interactive toy play. My playthroughs exposed disconnected pursuit, slow-motion aging and a rushed hatch. Tutor advice focused on sound and readable needs. Each led to a visible revision. This qualitative feedback explains my decisions, but it does not establish how every visitor will feel.</w:t>
+        <w:t>Classmates suggested background music, better toy interaction and more expressions, including the hungry pose. My tutor suggested sound effects and clearer needs. My playthroughs helped adjust the chase, senior rest and opening length. These changes made the pet more expressive and gave the player more to do. I also learned to check the whole action: changing a face alone did not fix awkward movement.</w:t>
       </w:r>
     </w:p>
     <w:p>
@@ -772,12 +762,12 @@
         <w:pStyle w:val="Heading2"/>
       </w:pPr>
       <w:r>
-        <w:t>中文对照 — 不另读</w:t>
+        <w:t>中文对照</w:t>
       </w:r>
     </w:p>
     <w:p>
       <w:r>
-        <w:t>同学建议促成了背景音乐、更丰富的表情和更有互动性的玩具。自己的试玩发现了隔空追球、慢放式衰老和太快的出场；老师的意见集中在声音与状态可读性。这些建议都对应了看得见的修改。这些定性反馈能够解释我的决定，但不能证明每位观众都会产生什么情绪。</w:t>
+        <w:t>同学建议加入背景音乐、增强玩具互动、丰富表情，包括饿扁形态。老师建议补充音效和更清楚的状态表现。自己的试玩帮助我调整追球、老年休息和开场长度。这些修改让小球更有表现力，也增加了可玩的内容。我还发现需要看完整动作：只换表情，不能解决奇怪的移动。</w:t>
       </w:r>
     </w:p>
     <w:p>
@@ -785,12 +775,12 @@
         <w:pStyle w:val="Heading2"/>
       </w:pPr>
       <w:r>
-        <w:t>Recording cue / 核实与操作提示</w:t>
+        <w:t>备注 — 不读 / Notes</w:t>
       </w:r>
     </w:p>
     <w:p>
       <w:r>
-        <w:t>基于作者报告的同学反馈、自己的试玩及老师意见。不得增添测试人数、姓名、伪造引语或已举办展览的说法。brief还要求给至少一名同学建设性反馈；作者尚未提供这一方向的具体经历，提交前补入真实记录。</w:t>
+        <w:t>根据作者回忆的同学建议、转述的老师意见和已有开发记录，不增添人数、日期、引语或正式研究结果。brief要求给同学的建设性反馈仍需作者提供真实例子。</w:t>
       </w:r>
     </w:p>
     <w:p>
@@ -803,7 +793,7 @@
         <w:pStyle w:val="Heading1"/>
       </w:pPr>
       <w:r>
-        <w:t>13  Consequences are part of caring</w:t>
+        <w:t>13  What works, and what I would improve</w:t>
       </w:r>
     </w:p>
     <w:p>
@@ -811,7 +801,7 @@
         <w:pStyle w:val="Subtitle"/>
       </w:pPr>
       <w:r>
-        <w:t>Suggested duration / 建议用时: 41 seconds</w:t>
+        <w:t>建议用时 / Suggested time: 35 seconds</w:t>
       </w:r>
     </w:p>
     <w:p>
@@ -824,7 +814,7 @@
     </w:p>
     <w:p>
       <w:r>
-        <w:t>Death is intentional. If the pet could never die from neglect, keeping it alive would carry less responsibility and challenge. Waste smells after six seconds and can cause illness death at thirteen; hunger or mood at zero for eight seconds can also be fatal. These consequences make attention matter. The question is whether a first-time player can understand the warning and respond fairly. I want to keep the challenge, while testing clearer cues and enough recovery time. Natural old age offers a different kind of ending.</w:t>
+        <w:t>The strongest part is how care changes across the pet’s life. Petting a mischievous young pet and comforting an older one use the same control, but are meant to feel different. Next, I would watch new players to see whether they discover the toy and understand danger signs in time. I want clearer cues while keeping the challenge. I would also check whether the shortened three-stage experience fits an exhibition visit.</w:t>
       </w:r>
     </w:p>
     <w:p>
@@ -832,12 +822,12 @@
         <w:pStyle w:val="Heading2"/>
       </w:pPr>
       <w:r>
-        <w:t>中文对照 — 不另读</w:t>
+        <w:t>中文对照</w:t>
       </w:r>
     </w:p>
     <w:p>
       <w:r>
-        <w:t>死亡是我有意加入的。如果怎么疏于照顾都不会死，养活它就少了责任感和挑战。粑粑六秒开始发臭，十三秒可能病死；饥饿或心情归零持续八秒也会致死。这些后果让关注和照顾变得重要。需要验证的是，第一次玩的玩家能否理解警告，并有公平的时间回应。我想保留挑战，同时测试更清楚的提示和足够的挽救时间。自然老死则提供了另一种结尾。</w:t>
+        <w:t>我认为最有力的是，照顾在不同阶段有了变化。摸摸调皮的青年和陪伴老年，用的是同一个操作，我希望感受不同。下一步，我会观察新玩家能否发现玩具、及时理解危险提示。我想让提示更清楚，同时保留挑战，也验证缩短后的三阶段是否适合展览体验。</w:t>
       </w:r>
     </w:p>
     <w:p>
@@ -845,12 +835,12 @@
         <w:pStyle w:val="Heading2"/>
       </w:pPr>
       <w:r>
-        <w:t>Recording cue / 核实与操作提示</w:t>
+        <w:t>备注 — 不读 / Notes</w:t>
       </w:r>
     </w:p>
     <w:p>
       <w:r>
-        <w:t>作者明确说明死亡用于增加责任感和挑战性，不把死亡本身写成失误。13秒是每个粑粑从产生起的总时长；不是发臭后13秒。公平性属于待验证问题，不声称观众实际感到焦虑。</w:t>
+        <w:t>这是基于当前作品的分析与下一步计划，不声称已完成独立观众研究。拟定展览为单人电脑交互；当前不是多人装置。</w:t>
       </w:r>
     </w:p>
     <w:p>
@@ -863,7 +853,7 @@
         <w:pStyle w:val="Heading1"/>
       </w:pPr>
       <w:r>
-        <w:t>14  What I would test next</w:t>
+        <w:t>14  From one egg to the next</w:t>
       </w:r>
     </w:p>
     <w:p>
@@ -871,7 +861,7 @@
         <w:pStyle w:val="Subtitle"/>
       </w:pPr>
       <w:r>
-        <w:t>Suggested duration / 建议用时: 28 seconds</w:t>
+        <w:t>建议用时 / Suggested time: 34 seconds</w:t>
       </w:r>
     </w:p>
     <w:p>
@@ -884,7 +874,7 @@
     </w:p>
     <w:p>
       <w:r>
-        <w:t>The three-stage revision already shortens the visit. I would next watch first-time players without coaching: do they discover dragging, understand refusal and act on warnings? I would compare clearer cues and slightly longer warning periods while keeping the risk of death. I would also check the revised duration. Saved progress and separate voice controls are future possibilities.</w:t>
+        <w:t>Little Rascal begins with naming a pet and choosing to look after it. As it grows, the player meets its playful side, its temper and its need for company. Death gives that care a consequence, and the new egg brings the life cycle back to the beginning. I want players to feel connected to their own little pet and responsible for the life they are looking after. Thank you.</w:t>
       </w:r>
     </w:p>
     <w:p>
@@ -892,25 +882,12 @@
         <w:pStyle w:val="Heading2"/>
       </w:pPr>
       <w:r>
-        <w:t>中文对照 — 不另读</w:t>
+        <w:t>中文对照</w:t>
       </w:r>
     </w:p>
     <w:p>
       <w:r>
-        <w:t>三阶段的修改已经缩短了体验。下一步，我会在不指导的情况下观察新玩家：他们能发现拖拽、理解拒绝、回应警告吗？我会保留死亡风险，比较更清楚的提示和稍长的警告时间，也验证缩短后的体验长度。存档和独立叫声控制是未来方向。</w:t>
-      </w:r>
-    </w:p>
-    <w:p>
-      <w:pPr>
-        <w:pStyle w:val="Heading2"/>
-      </w:pPr>
-      <w:r>
-        <w:t>Recording cue / 核实与操作提示</w:t>
-      </w:r>
-    </w:p>
-    <w:p>
-      <w:r>
-        <w:t>这是未来测试计划，不是已完成研究。若实际补录试玩，请取得参与者同意，并保留具体观察和修改依据。</w:t>
+        <w:t>Little Rascal 从起名和照顾开始。小球成长时，玩家会遇见它调皮的一面、它的脾气，以及它对陪伴的需要。死亡让照顾有了后果，新的蛋则让生命循环回到起点。我希望玩家和自己的小球建立情感连接，也对正在照顾的生命产生责任感。谢谢。</w:t>
       </w:r>
     </w:p>
     <w:p>
@@ -923,7 +900,7 @@
         <w:pStyle w:val="Heading1"/>
       </w:pPr>
       <w:r>
-        <w:t>15  A little life, then another beginning</w:t>
+        <w:t>15  How the movement works</w:t>
       </w:r>
     </w:p>
     <w:p>
@@ -931,7 +908,61 @@
         <w:pStyle w:val="Subtitle"/>
       </w:pPr>
       <w:r>
-        <w:t>Suggested duration / 建议用时: 25 seconds</w:t>
+        <w:t>附录，不另读 / Supporting appendix</w:t>
+      </w:r>
+    </w:p>
+    <w:p/>
+    <w:p>
+      <w:r>
+        <w:t>Ground position + jump height</w:t>
+      </w:r>
+    </w:p>
+    <w:p/>
+    <w:p>
+      <w:r>
+        <w:t>floor position</w:t>
+      </w:r>
+    </w:p>
+    <w:p>
+      <w:r>
+        <w:t>jump</w:t>
+        <w:br/>
+        <w:t>height</w:t>
+      </w:r>
+    </w:p>
+    <w:p>
+      <w:r>
+        <w:t>DRAWING</w:t>
+      </w:r>
+    </w:p>
+    <w:p>
+      <w:r>
+        <w:t>2D images, layered by floor position.</w:t>
+      </w:r>
+    </w:p>
+    <w:p>
+      <w:r>
+        <w:t>MOVEMENT</w:t>
+      </w:r>
+    </w:p>
+    <w:p>
+      <w:r>
+        <w:t>Separate airborne height; shadow on the floor.</w:t>
+      </w:r>
+    </w:p>
+    <w:p>
+      <w:r>
+        <w:t>TOY CONTACT</w:t>
+      </w:r>
+    </w:p>
+    <w:p>
+      <w:r>
+        <w:t>Collision checks trigger the kick and its sound.</w:t>
+      </w:r>
+    </w:p>
+    <w:p>
+      <w:r>
+        <w:t>Supporting diagram; no extra narration. Internal canvas stays at 900 × 640.</w:t>
       </w:r>
     </w:p>
     <w:p>
@@ -939,38 +970,12 @@
         <w:pStyle w:val="Heading2"/>
       </w:pPr>
       <w:r>
-        <w:t>English — spoken</w:t>
+        <w:t>备注 — 不读 / Notes</w:t>
       </w:r>
     </w:p>
     <w:p>
       <w:r>
-        <w:t>Each stage changes the relationship: the little one needs care, Youth sometimes resists, and Senior asks for closeness. Death gives that care consequences. The new egg completes the cycle of birth, growth, farewell and renewal. I want the player to remember the life they cared for, even as another begins.</w:t>
-      </w:r>
-    </w:p>
-    <w:p>
-      <w:pPr>
-        <w:pStyle w:val="Heading2"/>
-      </w:pPr>
-      <w:r>
-        <w:t>中文对照 — 不另读</w:t>
-      </w:r>
-    </w:p>
-    <w:p>
-      <w:r>
-        <w:t>每个阶段都在改变这段关系：幼年需要照顾，青年有时拒绝，老年主动寻求陪伴。死亡让照顾有了后果。新的蛋完成了出生、成长、告别和新生的循环。我希望即使新的相遇开始，玩家也会记得自己曾经照顾过的这段生命。</w:t>
-      </w:r>
-    </w:p>
-    <w:p>
-      <w:pPr>
-        <w:pStyle w:val="Heading2"/>
-      </w:pPr>
-      <w:r>
-        <w:t>Recording cue / 核实与操作提示</w:t>
-      </w:r>
-    </w:p>
-    <w:p>
-      <w:r>
-        <w:t>生命循环是设计主题，不声称程序持久保存上一世记忆或名字，也不声称新蛋就是同一只宠物转生。新蛋重新进入既有出场、命名与照顾流程。</w:t>
+        <w:t>补充说明，不占正文口播。p5.js二维绘制；地面坐标与跳跃高度分离；影子贴地；按地面Y排序。球与宠物的接触检测单独决定踢球。内部900×640，CSS仅适配显示。避免把坐标分离误说成足以实现接触检测。</w:t>
       </w:r>
     </w:p>
     <w:p>
@@ -991,17 +996,7 @@
         <w:pStyle w:val="Subtitle"/>
       </w:pPr>
       <w:r>
-        <w:t>Appendix / 不读</w:t>
-      </w:r>
-    </w:p>
-    <w:p>
-      <w:r>
-        <w:t>LITTLE RASCAL  /  EMOTIONAL INTERACTIONS</w:t>
-      </w:r>
-    </w:p>
-    <w:p>
-      <w:r>
-        <w:t>16</w:t>
+        <w:t>附录，不另读 / Supporting appendix</w:t>
       </w:r>
     </w:p>
     <w:p>
@@ -1053,7 +1048,7 @@
       <w:r>
         <w:t>Little Rascal. Source: https://github.com/itsangelia/little-rascal</w:t>
         <w:br/>
-        <w:t>Gameplay baseline: d3ab74f. Images show current staged game states, not audience footage.</w:t>
+        <w:t>Gameplay baseline: 387cfd0. Images show current staged game states, not audience footage.</w:t>
       </w:r>
     </w:p>
     <w:p>
@@ -1076,7 +1071,7 @@
         <w:pStyle w:val="Heading2"/>
       </w:pPr>
       <w:r>
-        <w:t>Recording cue / 核实与操作提示</w:t>
+        <w:t>备注 — 不读 / Notes</w:t>
       </w:r>
     </w:p>
     <w:p>
@@ -1102,17 +1097,7 @@
         <w:pStyle w:val="Subtitle"/>
       </w:pPr>
       <w:r>
-        <w:t>Appendix / 不读</w:t>
-      </w:r>
-    </w:p>
-    <w:p>
-      <w:r>
-        <w:t>LITTLE RASCAL  /  EMOTIONAL INTERACTIONS</w:t>
-      </w:r>
-    </w:p>
-    <w:p>
-      <w:r>
-        <w:t>17</w:t>
+        <w:t>附录，不另读 / Supporting appendix</w:t>
       </w:r>
     </w:p>
     <w:p>
@@ -1130,6 +1115,7 @@
         <w:t>The designer confirms tutor approval for AI assistance. The record documents their selections, rejected options and repeated revisions. Personal analysis must be checked and expressed in their own words.</w:t>
       </w:r>
     </w:p>
+    <w:p/>
     <w:p>
       <w:r>
         <w:t>Submission checks</w:t>
@@ -1152,7 +1138,7 @@
         <w:pStyle w:val="Heading2"/>
       </w:pPr>
       <w:r>
-        <w:t>Recording cue / 核实与操作提示</w:t>
+        <w:t>备注 — 不读 / Notes</w:t>
       </w:r>
     </w:p>
     <w:p>
@@ -1170,7 +1156,7 @@
         <w:pStyle w:val="Heading1"/>
       </w:pPr>
       <w:r>
-        <w:t>Assessment coverage / 对照老师要求</w:t>
+        <w:t>要求对应与提交补充 — 不读</w:t>
       </w:r>
     </w:p>
     <w:p>
@@ -1178,12 +1164,12 @@
         <w:pStyle w:val="Heading2"/>
       </w:pPr>
       <w:r>
-        <w:t>Context /10</w:t>
+        <w:t>展览语境</w:t>
       </w:r>
     </w:p>
     <w:p>
       <w:r>
-        <w:t>Slides 2–3: proposed encounter, first-click discovery, mouse/headphone setting; explicitly not a documented exhibition.</w:t>
+        <w:t>第2–3页：从哪里开始、如何发现和操作；第13页：拟定展览体验和下一步观察。电脑/鼠标/耳机为拟定形式，不冒充已举办展览。</w:t>
       </w:r>
     </w:p>
     <w:p>
@@ -1191,12 +1177,12 @@
         <w:pStyle w:val="Heading2"/>
       </w:pPr>
       <w:r>
-        <w:t>Narrative &amp; interaction /25</w:t>
+        <w:t>情感设计与互动</w:t>
       </w:r>
     </w:p>
     <w:p>
       <w:r>
-        <w:t>Slides 3–7, 9–11: real input/response, growth conditions, resistance, visible needs and player-controlled farewell.</w:t>
+        <w:t>第2、4–11页：起名、照顾、性格、衰老、责任和挑战、信与生命循环；第4页联系Norman。</w:t>
       </w:r>
     </w:p>
     <w:p>
@@ -1204,12 +1190,12 @@
         <w:pStyle w:val="Heading2"/>
       </w:pPr>
       <w:r>
-        <w:t>Aesthetics &amp; creativity /25</w:t>
+        <w:t>迭代与反馈</w:t>
       </w:r>
     </w:p>
     <w:p>
       <w:r>
-        <w:t>Slides 4, 6, 8–11: Norman, physical contact, hop/rest rhythm, bodily hunger and a clickable envelope.</w:t>
+        <w:t>第5–9、12页：四减三、玩具、表情、衰老动作与声音，区分同学/老师/自己的试玩。</w:t>
       </w:r>
     </w:p>
     <w:p>
@@ -1217,12 +1203,12 @@
         <w:pStyle w:val="Heading2"/>
       </w:pPr>
       <w:r>
-        <w:t>Process &amp; feedback /15</w:t>
+        <w:t>反思</w:t>
       </w:r>
     </w:p>
     <w:p>
       <w:r>
-        <w:t>Slides 5–12, 16–17: own iteration comparisons, tutor suggestions, sources and AI disclosure. Includes designer-reported peer suggestions; the designer’s feedback given to another student still needs documentation.</w:t>
+        <w:t>第13页：优点、操作发现与警告可读性的限制，以及具体未来观察；不以技术排错代替设计反思。</w:t>
       </w:r>
     </w:p>
     <w:p>
@@ -1230,12 +1216,12 @@
         <w:pStyle w:val="Heading2"/>
       </w:pPr>
       <w:r>
-        <w:t>Reflection &amp; communication /20</w:t>
+        <w:t>引用与AI</w:t>
       </w:r>
     </w:p>
     <w:p>
       <w:r>
-        <w:t>Slides 7, 12–15: misunderstanding risk, evidence limits, punitive timing, exhibition dwell time and a concrete future test plan.</w:t>
+        <w:t>第16–17页：来源与AI声明。作者已确认老师允许AI辅助、叫声本人录制；音乐曲名、作者、原链接仍需补全。</w:t>
       </w:r>
     </w:p>
     <w:p>
@@ -1243,88 +1229,20 @@
         <w:pStyle w:val="Heading2"/>
       </w:pPr>
       <w:r>
-        <w:t>Milestone check-in /5</w:t>
+        <w:t>仍需补充</w:t>
       </w:r>
     </w:p>
     <w:p>
       <w:r>
-        <w:t>Rubric separately lists A2 Milestone Check-In. A final slide deck does not establish attendance, blog submission or feedback given to a peer.</w:t>
+        <w:t>实际两分钟演示录像；你给其他同学的建设性反馈实例；Curtin封面、姓名学号、视频公开链接和上传时间截图。文件命名A2_Surname_GivenName_StudentNumber_FileName。</w:t>
       </w:r>
     </w:p>
     <w:p>
-      <w:pPr>
-        <w:pStyle w:val="Heading1"/>
-      </w:pPr>
       <w:r>
-        <w:t>Before submission / 必须由你补齐</w:t>
-      </w:r>
-    </w:p>
-    <w:p>
-      <w:pPr>
-        <w:pStyle w:val="ListBullet"/>
-      </w:pPr>
-      <w:r>
-        <w:t>已纳入你报告的同学建议。按brief第3页要求，还需要记录你给至少一名同学的具体建设性反馈，并保留真实试玩观察。不要虚构参与人数或引语。</w:t>
-      </w:r>
-    </w:p>
-    <w:p>
-      <w:pPr>
-        <w:pStyle w:val="ListBullet"/>
-      </w:pPr>
-      <w:r>
-        <w:t>你已确认获得老师对AI辅助的许可。brief第2页与第4页仍要求：AI支持而非替代自己的思考，提交时附准确的实际使用声明。请核实声明范围。</w:t>
-      </w:r>
-    </w:p>
-    <w:p>
-      <w:pPr>
-        <w:pStyle w:val="ListBullet"/>
-      </w:pPr>
-      <w:r>
-        <w:t>叫声按你确认标为本人录制；背景音乐按Pixabay标注，补全曲名、作者及原下载链接（你写的是pixaboy，请核对平台拼写）。补全参考游戏信息，区分本人原画与AI辅助迭代素材。</w:t>
-      </w:r>
-    </w:p>
-    <w:p>
-      <w:pPr>
-        <w:pStyle w:val="ListBullet"/>
-      </w:pPr>
-      <w:r>
-        <w:t>录制两分钟真实游戏演示并放入最终视频；当前PPT没有内嵌录像。整段排练在8–10分钟内，不用中英各读一次。</w:t>
-      </w:r>
-    </w:p>
-    <w:p>
-      <w:pPr>
-        <w:pStyle w:val="ListBullet"/>
-      </w:pPr>
-      <w:r>
-        <w:t>使用Curtin标准封面，在Declaration处填写本人姓名作为数字签名；封面模板、姓名与学号未提供，不能代填。</w:t>
-      </w:r>
-    </w:p>
-    <w:p>
-      <w:pPr>
-        <w:pStyle w:val="ListBullet"/>
-      </w:pPr>
-      <w:r>
-        <w:t>写明不失效且公开可访问的视频链接，并附上传时间截图；同时提供清楚标注的工作文件/仓库链接。</w:t>
-      </w:r>
-    </w:p>
-    <w:p>
-      <w:pPr>
-        <w:pStyle w:val="ListBullet"/>
-      </w:pPr>
-      <w:r>
-        <w:t>提交文件名：A2_Surname_GivenName_StudentNumber_FileName。原始brief没有提供具体截止日期，只写Week13，按Blackboard确认。</w:t>
-      </w:r>
-    </w:p>
-    <w:p>
-      <w:pPr>
-        <w:pStyle w:val="ListBullet"/>
-      </w:pPr>
-      <w:r>
-        <w:t>按unit outline规定格式统一引用；这两份PDF没有指定APA/Chicago等具体格式，因此当前使用作者—年份草稿，不冒称完全符合某一种格式。</w:t>
+        <w:t>第一人称分析根据你的设计指令和反馈编辑，请核实措辞是否符合你的真实想法。参考格式最终按unit outline统一。</w:t>
       </w:r>
     </w:p>
     <w:sectPr>
-      <w:footerReference w:type="default" r:id="rId9"/>
       <w:pgSz w:w="12240" w:h="15840"/>
       <w:pgMar w:top="936" w:right="1080" w:bottom="936" w:left="1080" w:header="720" w:footer="720" w:gutter="0"/>
       <w:cols w:space="720"/>
@@ -1332,21 +1250,6 @@
     </w:sectPr>
   </w:body>
 </w:document>
-</file>
-
-<file path=word/footer1.xml><?xml version="1.0" encoding="utf-8"?>
-<w:ftr xmlns:m="http://schemas.openxmlformats.org/officeDocument/2006/math" xmlns:mc="http://schemas.openxmlformats.org/markup-compatibility/2006" xmlns:mo="http://schemas.microsoft.com/office/mac/office/2008/main" xmlns:mv="urn:schemas-microsoft-com:mac:vml" xmlns:o="urn:schemas-microsoft-com:office:office" xmlns:r="http://schemas.openxmlformats.org/officeDocument/2006/relationships" xmlns:v="urn:schemas-microsoft-com:vml" xmlns:w10="urn:schemas-microsoft-com:office:word" xmlns:w14="http://schemas.microsoft.com/office/word/2010/wordml" xmlns:w="http://schemas.openxmlformats.org/wordprocessingml/2006/main" xmlns:wne="http://schemas.microsoft.com/office/word/2006/wordml" xmlns:wp14="http://schemas.microsoft.com/office/word/2010/wordprocessingDrawing" xmlns:wp="http://schemas.openxmlformats.org/drawingml/2006/wordprocessingDrawing" xmlns:wpc="http://schemas.microsoft.com/office/word/2010/wordprocessingCanvas" xmlns:wpg="http://schemas.microsoft.com/office/word/2010/wordprocessingGroup" xmlns:wpi="http://schemas.microsoft.com/office/word/2010/wordprocessingInk" xmlns:wps="http://schemas.microsoft.com/office/word/2010/wordprocessingShape" mc:Ignorable="w14 wp14">
-  <w:p>
-    <w:pPr>
-      <w:pStyle w:val="Footer"/>
-      <w:jc w:val="right"/>
-    </w:pPr>
-    <w:r>
-      <w:t xml:space="preserve">Little Rascal · Editorial revision · </w:t>
-    </w:r>
-    <w:fldSimple w:instr="PAGE"/>
-  </w:p>
-</w:ftr>
 </file>
 
 <file path=word/numbering.xml><?xml version="1.0" encoding="utf-8"?>
@@ -1713,11 +1616,11 @@
     <w:qFormat/>
     <w:rsid w:val="00FC693F"/>
     <w:pPr>
-      <w:spacing w:after="140"/>
+      <w:spacing w:after="160"/>
     </w:pPr>
     <w:rPr>
       <w:rFonts w:ascii="Arial" w:hAnsi="Arial" w:eastAsia="Noto Sans CJK SC"/>
-      <w:sz w:val="21"/>
+      <w:sz w:val="22"/>
     </w:rPr>
   </w:style>
   <w:style w:type="paragraph" w:styleId="Header">

</xml_diff>